<commit_message>
feat: rewrite portfolio with live projects, restored SEO, and cleaned assets
Add three live personal projects (AI QA Agent, Dep Scanner, DevStatus) as
featured entries with screenshots and clickable Vercel URLs. Replace pixelated
BCPOS project screenshots with metric cards. Restore OG/Twitter meta tags,
canonical URL, theme-color, apple-touch-icon, and webmanifest that were lost
in the layout rewrite. Migrate favicons out of parenthesized subfolder. Fix
webmanifest icon paths and metadata. Add reduced-motion CSS guard. Update
resume files. Add gitignore rules for dev artifacts.

Co-Authored-By: Claude Opus 4.6 (1M context) <noreply@anthropic.com>
</commit_message>
<xml_diff>
--- a/assets/LA_Resume_.docx
+++ b/assets/LA_Resume_.docx
@@ -1,1382 +1,946 @@
 
 <file path=word/document.xml><?xml version="1.0" encoding="utf-8"?>
-<ns0:document xmlns:ns0="http://schemas.openxmlformats.org/wordprocessingml/2006/main" xmlns:ns1="http://schemas.openxmlformats.org/markup-compatibility/2006" ns1:Ignorable="w14 wp14">
-  <ns0:body>
-    <ns0:p>
-      <ns0:pPr>
-        <ns0:spacing ns0:after="40"/>
-        <ns0:jc ns0:val="center"/>
-      </ns0:pPr>
-      <ns0:r>
-        <ns0:rPr>
-          <ns0:b/>
-          <ns0:color ns0:val="1F4E79"/>
-          <ns0:sz ns0:val="44"/>
-        </ns0:rPr>
-        <ns0:t>LUIS RODRIGUEZ</ns0:t>
-      </ns0:r>
-    </ns0:p>
-    <ns0:p>
-      <ns0:pPr>
-        <ns0:spacing ns0:after="0"/>
-        <ns0:jc ns0:val="center"/>
-      </ns0:pPr>
-      <ns0:r>
-        <ns0:rPr>
-          <ns0:color ns0:val="555555"/>
-          <ns0:sz ns0:val="18"/>
-        </ns0:rPr>
-        <ns0:t>Senior Full-Stack Engineer | Systems Architect | React, .NET, Azure</ns0:t>
-      </ns0:r>
-    </ns0:p>
-    <ns0:p>
-      <ns0:pPr>
-        <ns0:spacing ns0:after="80"/>
-        <ns0:jc ns0:val="center"/>
-      </ns0:pPr>
-      <ns0:r>
-        <ns0:rPr>
-          <ns0:color ns0:val="555555"/>
-          <ns0:sz ns0:val="18"/>
-        </ns0:rPr>
-        <ns0:t>Toa Alta, Puerto Rico | 787-980-5868 | luisangelrod17@gmail.com | linkedin.com/in/luis-rodriguez-515858bb | github.com/lrodriguez | luisrodriguezdev.netlify.app</ns0:t>
-      </ns0:r>
-    </ns0:p>
-    <ns0:p>
-      <ns0:pPr>
-        <ns0:spacing ns0:before="200" ns0:after="80"/>
-        <ns0:pBdr>
-          <ns0:bottom ns0:val="single" ns0:sz="4" ns0:space="1" ns0:color="1F4E79"/>
-        </ns0:pBdr>
-      </ns0:pPr>
-      <ns0:r>
-        <ns0:rPr>
-          <ns0:b/>
-          <ns0:color ns0:val="1F4E79"/>
-          <ns0:sz ns0:val="22"/>
-        </ns0:rPr>
-        <ns0:t>SUMMARY</ns0:t>
-      </ns0:r>
-    </ns0:p>
-    <ns0:p>
-      <ns0:pPr>
-        <ns0:spacing ns0:before="20" ns0:after="60"/>
-      </ns0:pPr>
-      <ns0:r>
-        <ns0:rPr>
-          <ns0:color ns0:val="333333"/>
-          <ns0:sz ns0:val="19"/>
-        </ns0:rPr>
-        <ns0:t>Senior Full-Stack Engineer and Systems Architect with 5+ years of experience building enterprise web, mobile, kiosk, and POS systems using React, TypeScript, C#, .NET, SQL Server, and Azure. Delivered 4 production systems in 6 months as a sole engineer, owning architecture, development, testing, deployment, and production support end to end. Background spans payments, logistics, healthcare, and government platforms in PCI DSS, HIPAA-adjacent, and regulated environments. Known for combining strong engineering fundamentals with AI-assisted delivery workflows to ship faster without sacrificing reliability, security, or maintainability. Fluent in English and Spanish. 100% remote since 2021.</ns0:t>
-      </ns0:r>
-    </ns0:p>
-    <ns0:p>
-      <ns0:pPr>
-        <ns0:spacing ns0:before="200" ns0:after="80"/>
-        <ns0:pBdr>
-          <ns0:bottom ns0:val="single" ns0:sz="4" ns0:space="1" ns0:color="1F4E79"/>
-        </ns0:pBdr>
-      </ns0:pPr>
-      <ns0:r>
-        <ns0:rPr>
-          <ns0:b/>
-          <ns0:color ns0:val="1F4E79"/>
-          <ns0:sz ns0:val="22"/>
-        </ns0:rPr>
-        <ns0:t>SELECTED HIGHLIGHTS</ns0:t>
-      </ns0:r>
-    </ns0:p>
-    <ns0:p>
-      <ns0:pPr>
-        <ns0:pStyle ns0:val="ListBullet"/>
-        <ns0:spacing ns0:before="0" ns0:after="20"/>
-        <ns0:ind ns0:left="432"/>
-      </ns0:pPr>
-      <ns0:r>
-        <ns0:rPr>
-          <ns0:b/>
-          <ns0:color ns0:val="333333"/>
-          <ns0:sz ns0:val="19"/>
-        </ns0:rPr>
-        <ns0:t xml:space="preserve">Delivered 4 production systems in 6 months as a sole engineer, from database schema to cloud deployment</ns0:t>
-      </ns0:r>
-      <ns0:r>
-        <ns0:rPr>
-          <ns0:color ns0:val="333333"/>
-          <ns0:sz ns0:val="19"/>
-        </ns0:rPr>
-        <ns0:t/>
-      </ns0:r>
-    </ns0:p>
-    <ns0:p>
-      <ns0:pPr>
-        <ns0:pStyle ns0:val="ListBullet"/>
-        <ns0:spacing ns0:before="0" ns0:after="20"/>
-        <ns0:ind ns0:left="432"/>
-      </ns0:pPr>
-      <ns0:r>
-        <ns0:rPr>
-          <ns0:b/>
-          <ns0:color ns0:val="333333"/>
-          <ns0:sz ns0:val="19"/>
-        </ns0:rPr>
-        <ns0:t xml:space="preserve">Maintained and extended 50+ POS integrations across payment, pharmacy, and e-commerce platforms</ns0:t>
-      </ns0:r>
-      <ns0:r>
-        <ns0:rPr>
-          <ns0:color ns0:val="333333"/>
-          <ns0:sz ns0:val="19"/>
-        </ns0:rPr>
-        <ns0:t/>
-      </ns0:r>
-    </ns0:p>
-    <ns0:p>
-      <ns0:pPr>
-        <ns0:pStyle ns0:val="ListBullet"/>
-        <ns0:spacing ns0:before="0" ns0:after="20"/>
-        <ns0:ind ns0:left="432"/>
-      </ns0:pPr>
-      <ns0:r>
-        <ns0:rPr>
-          <ns0:b/>
-          <ns0:color ns0:val="333333"/>
-          <ns0:sz ns0:val="19"/>
-        </ns0:rPr>
-        <ns0:t xml:space="preserve">Scaled delivery through AI-assisted engineering workflows, automated review, and structured implementation plans</ns0:t>
-      </ns0:r>
-      <ns0:r>
-        <ns0:rPr>
-          <ns0:color ns0:val="333333"/>
-          <ns0:sz ns0:val="19"/>
-        </ns0:rPr>
-        <ns0:t/>
-      </ns0:r>
-    </ns0:p>
-    <ns0:p>
-      <ns0:pPr>
-        <ns0:pStyle ns0:val="ListBullet"/>
-        <ns0:spacing ns0:before="0" ns0:after="20"/>
-        <ns0:ind ns0:left="432"/>
-      </ns0:pPr>
-      <ns0:r>
-        <ns0:rPr>
-          <ns0:b/>
-          <ns0:color ns0:val="333333"/>
-          <ns0:sz ns0:val="19"/>
-        </ns0:rPr>
-        <ns0:t xml:space="preserve">Built resilient offline-first systems for hardware-integrated payments, kiosks, and real-time logistics workflows</ns0:t>
-      </ns0:r>
-      <ns0:r>
-        <ns0:rPr>
-          <ns0:color ns0:val="333333"/>
-          <ns0:sz ns0:val="19"/>
-        </ns0:rPr>
-        <ns0:t/>
-      </ns0:r>
-    </ns0:p>
-    <ns0:p>
-      <ns0:pPr>
-        <ns0:pStyle ns0:val="ListBullet"/>
-        <ns0:spacing ns0:before="0" ns0:after="20"/>
-        <ns0:ind ns0:left="432"/>
-      </ns0:pPr>
-      <ns0:r>
-        <ns0:rPr>
-          <ns0:b/>
-          <ns0:color ns0:val="333333"/>
-          <ns0:sz ns0:val="19"/>
-        </ns0:rPr>
-        <ns0:t xml:space="preserve">Delivered systems in PCI DSS, HIPAA-adjacent, and government-regulated environments</ns0:t>
-      </ns0:r>
-      <ns0:r>
-        <ns0:rPr>
-          <ns0:color ns0:val="333333"/>
-          <ns0:sz ns0:val="19"/>
-        </ns0:rPr>
-        <ns0:t/>
-      </ns0:r>
-    </ns0:p>
-    <ns0:p>
-      <ns0:pPr>
-        <ns0:spacing ns0:before="200" ns0:after="80"/>
-        <ns0:pBdr>
-          <ns0:bottom ns0:val="single" ns0:sz="4" ns0:space="1" ns0:color="1F4E79"/>
-        </ns0:pBdr>
-      </ns0:pPr>
-      <ns0:r>
-        <ns0:rPr>
-          <ns0:b/>
-          <ns0:color ns0:val="1F4E79"/>
-          <ns0:sz ns0:val="22"/>
-        </ns0:rPr>
-        <ns0:t>TECHNICAL SKILLS</ns0:t>
-      </ns0:r>
-    </ns0:p>
-    <ns0:p>
-      <ns0:pPr>
-        <ns0:spacing ns0:before="0" ns0:after="20"/>
-      </ns0:pPr>
-      <ns0:r>
-        <ns0:rPr>
-          <ns0:b/>
-          <ns0:color ns0:val="000000"/>
-          <ns0:sz ns0:val="19"/>
-        </ns0:rPr>
-        <ns0:t xml:space="preserve">Languages: </ns0:t>
-      </ns0:r>
-      <ns0:r>
-        <ns0:rPr>
-          <ns0:color ns0:val="333333"/>
-          <ns0:sz ns0:val="19"/>
-        </ns0:rPr>
-        <ns0:t>TypeScript, JavaScript, C#, SQL, HTML5, CSS3</ns0:t>
-      </ns0:r>
-    </ns0:p>
-    <ns0:p>
-      <ns0:pPr>
-        <ns0:spacing ns0:before="0" ns0:after="20"/>
-      </ns0:pPr>
-      <ns0:r>
-        <ns0:rPr>
-          <ns0:b/>
-          <ns0:color ns0:val="000000"/>
-          <ns0:sz ns0:val="19"/>
-        </ns0:rPr>
-        <ns0:t xml:space="preserve">Frontend: React, Angular, Ionic, Vite, Tailwind CSS, TanStack Query, Zustand, Zod, i18next, React Router</ns0:t>
-      </ns0:r>
-      <ns0:r>
-        <ns0:rPr>
-          <ns0:color ns0:val="333333"/>
-          <ns0:sz ns0:val="19"/>
-        </ns0:rPr>
-        <ns0:t/>
-      </ns0:r>
-    </ns0:p>
-    <ns0:p>
-      <ns0:pPr>
-        <ns0:spacing ns0:before="0" ns0:after="20"/>
-      </ns0:pPr>
-      <ns0:r>
-        <ns0:rPr>
-          <ns0:b/>
-          <ns0:color ns0:val="000000"/>
-          <ns0:sz ns0:val="19"/>
-        </ns0:rPr>
-        <ns0:t xml:space="preserve">Backend: .NET, ASP.NET Core, Entity Framework Core, Node.js, REST API Design, Minimal APIs</ns0:t>
-      </ns0:r>
-      <ns0:r>
-        <ns0:rPr>
-          <ns0:color ns0:val="333333"/>
-          <ns0:sz ns0:val="19"/>
-        </ns0:rPr>
-        <ns0:t/>
-      </ns0:r>
-    </ns0:p>
-    <ns0:p>
-      <ns0:pPr>
-        <ns0:spacing ns0:before="0" ns0:after="20"/>
-      </ns0:pPr>
-      <ns0:r>
-        <ns0:rPr>
-          <ns0:b/>
-          <ns0:color ns0:val="000000"/>
-          <ns0:sz ns0:val="19"/>
-        </ns0:rPr>
-        <ns0:t xml:space="preserve">Mobile/Desktop: Ionic + Capacitor, WPF + WebView2, Progressive Web Apps (PWA)</ns0:t>
-      </ns0:r>
-      <ns0:r>
-        <ns0:rPr>
-          <ns0:color ns0:val="333333"/>
-          <ns0:sz ns0:val="19"/>
-        </ns0:rPr>
-        <ns0:t/>
-      </ns0:r>
-    </ns0:p>
-    <ns0:p>
-      <ns0:pPr>
-        <ns0:spacing ns0:before="0" ns0:after="20"/>
-      </ns0:pPr>
-      <ns0:r>
-        <ns0:rPr>
-          <ns0:b/>
-          <ns0:color ns0:val="000000"/>
-          <ns0:sz ns0:val="19"/>
-        </ns0:rPr>
-        <ns0:t xml:space="preserve">Cloud &amp; DevOps: Azure App Service, Azure SQL, Azure Static Web Apps, Bicep, GitHub Actions, GitLab CI/CD, Azure DevOps, AWS</ns0:t>
-      </ns0:r>
-      <ns0:r>
-        <ns0:rPr>
-          <ns0:color ns0:val="333333"/>
-          <ns0:sz ns0:val="19"/>
-        </ns0:rPr>
-        <ns0:t/>
-      </ns0:r>
-    </ns0:p>
-    <ns0:p>
-      <ns0:pPr>
-        <ns0:spacing ns0:before="0" ns0:after="20"/>
-      </ns0:pPr>
-      <ns0:r>
-        <ns0:rPr>
-          <ns0:b/>
-          <ns0:color ns0:val="000000"/>
-          <ns0:sz ns0:val="19"/>
-        </ns0:rPr>
-        <ns0:t xml:space="preserve">Databases: SQL Server, Azure SQL, Temporal Tables</ns0:t>
-      </ns0:r>
-      <ns0:r>
-        <ns0:rPr>
-          <ns0:color ns0:val="333333"/>
-          <ns0:sz ns0:val="19"/>
-        </ns0:rPr>
-        <ns0:t/>
-      </ns0:r>
-    </ns0:p>
-    <ns0:p>
-      <ns0:pPr>
-        <ns0:spacing ns0:before="0" ns0:after="20"/>
-      </ns0:pPr>
-      <ns0:r>
-        <ns0:rPr>
-          <ns0:b/>
-          <ns0:color ns0:val="000000"/>
-          <ns0:sz ns0:val="19"/>
-        </ns0:rPr>
-        <ns0:t xml:space="preserve">Architecture: Clean Architecture, Microservices, Offline-First Sync, Event-Driven Patterns, Circuit Breakers, Retries, Bulkheads, Idempotency Design</ns0:t>
-      </ns0:r>
-      <ns0:r>
-        <ns0:rPr>
-          <ns0:color ns0:val="333333"/>
-          <ns0:sz ns0:val="19"/>
-        </ns0:rPr>
-        <ns0:t/>
-      </ns0:r>
-    </ns0:p>
-    <ns0:p>
-      <ns0:pPr>
-        <ns0:spacing ns0:before="0" ns0:after="20"/>
-      </ns0:pPr>
-      <ns0:r>
-        <ns0:rPr>
-          <ns0:b/>
-          <ns0:color ns0:val="000000"/>
-          <ns0:sz ns0:val="19"/>
-        </ns0:rPr>
-        <ns0:t xml:space="preserve">AI-Assisted Delivery: AI-assisted implementation plans, project context engineering, automated code review pipelines, runtime validation design</ns0:t>
-      </ns0:r>
-      <ns0:r>
-        <ns0:rPr>
-          <ns0:color ns0:val="333333"/>
-          <ns0:sz ns0:val="19"/>
-        </ns0:rPr>
-        <ns0:t/>
-      </ns0:r>
-    </ns0:p>
-    <ns0:p>
-      <ns0:pPr>
-        <ns0:spacing ns0:before="0" ns0:after="20"/>
-      </ns0:pPr>
-      <ns0:r>
-        <ns0:rPr>
-          <ns0:b/>
-          <ns0:color ns0:val="000000"/>
-          <ns0:sz ns0:val="19"/>
-        </ns0:rPr>
-        <ns0:t xml:space="preserve">Testing: </ns0:t>
-      </ns0:r>
-      <ns0:r>
-        <ns0:rPr>
-          <ns0:color ns0:val="333333"/>
-          <ns0:sz ns0:val="19"/>
-        </ns0:rPr>
-        <ns0:t>Vitest, Playwright E2E, Jest, Cypress, Jasmine</ns0:t>
-      </ns0:r>
-    </ns0:p>
-    <ns0:p>
-      <ns0:pPr>
-        <ns0:spacing ns0:before="0" ns0:after="20"/>
-      </ns0:pPr>
-      <ns0:r>
-        <ns0:rPr>
-          <ns0:b/>
-          <ns0:color ns0:val="000000"/>
-          <ns0:sz ns0:val="19"/>
-        </ns0:rPr>
-        <ns0:t xml:space="preserve">Security: JWT Authentication, RBAC, Runtime Validation, XSS Protection, CSRF Protection, Rate Limiting, WCAG 2.1 AA</ns0:t>
-      </ns0:r>
-      <ns0:r>
-        <ns0:rPr>
-          <ns0:color ns0:val="333333"/>
-          <ns0:sz ns0:val="19"/>
-        </ns0:rPr>
-        <ns0:t/>
-      </ns0:r>
-    </ns0:p>
-    <ns0:p>
-      <ns0:pPr>
-        <ns0:spacing ns0:before="0" ns0:after="20"/>
-      </ns0:pPr>
-      <ns0:r>
-        <ns0:rPr>
-          <ns0:b/>
-          <ns0:color ns0:val="000000"/>
-          <ns0:sz ns0:val="19"/>
-        </ns0:rPr>
-        <ns0:t xml:space="preserve">Tools: </ns0:t>
-      </ns0:r>
-      <ns0:r>
-        <ns0:rPr>
-          <ns0:color ns0:val="333333"/>
-          <ns0:sz ns0:val="19"/>
-        </ns0:rPr>
-        <ns0:t>VS Code, Postman, Figma, Jira, Azure Data Studio, Serilog, Git</ns0:t>
-      </ns0:r>
-    </ns0:p>
-    <ns0:p>
-      <ns0:pPr>
-        <ns0:spacing ns0:before="200" ns0:after="80"/>
-        <ns0:pBdr>
-          <ns0:bottom ns0:val="single" ns0:sz="4" ns0:space="1" ns0:color="1F4E79"/>
-        </ns0:pBdr>
-      </ns0:pPr>
-      <ns0:r>
-        <ns0:rPr>
-          <ns0:b/>
-          <ns0:color ns0:val="1F4E79"/>
-          <ns0:sz ns0:val="22"/>
-        </ns0:rPr>
-        <ns0:t>PROFESSIONAL EXPERIENCE</ns0:t>
-      </ns0:r>
-    </ns0:p>
-    <ns0:p>
-      <ns0:pPr>
-        <ns0:spacing ns0:before="160" ns0:after="20"/>
-      </ns0:pPr>
-      <ns0:r>
-        <ns0:rPr>
-          <ns0:b/>
-          <ns0:color ns0:val="000000"/>
-          <ns0:sz ns0:val="21"/>
-        </ns0:rPr>
-        <ns0:t>Business Computer POS - Systems Architect &amp; Engineering Lead</ns0:t>
-      </ns0:r>
-      <ns0:r>
-        <ns0:rPr>
-          <ns0:i/>
-          <ns0:color ns0:val="333333"/>
-          <ns0:sz ns0:val="21"/>
-        </ns0:rPr>
-        <ns0:t xml:space="preserve"/>
-      </ns0:r>
-    </ns0:p>
-    <ns0:p>
-      <ns0:pPr>
-        <ns0:spacing ns0:before="0" ns0:after="60"/>
-      </ns0:pPr>
-      <ns0:r>
-        <ns0:rPr>
-          <ns0:i/>
-          <ns0:color ns0:val="555555"/>
-          <ns0:sz ns0:val="18"/>
-        </ns0:rPr>
-        <ns0:t>Remote / Bayamon, PR | September 2025 – Present</ns0:t>
-      </ns0:r>
-    </ns0:p>
-    <ns0:p>
-      <ns0:pPr>
-        <ns0:spacing ns0:before="20" ns0:after="60"/>
-      </ns0:pPr>
-      <ns0:r>
-        <ns0:rPr>
-          <ns0:color ns0:val="333333"/>
-          <ns0:sz ns0:val="19"/>
-        </ns0:rPr>
-        <ns0:t>Promoted from mid-level developer to systems architect within 3 months. Lead technical decision-maker and hands-on engineer for architecture, UI/UX, frontend, backend, database, cloud infrastructure, QA, and production support across 50+ active projects. Built a repeatable AI-assisted delivery workflow that increased speed while maintaining code quality, security, and production reliability.</ns0:t>
-      </ns0:r>
-    </ns0:p>
-    <ns0:p>
-      <ns0:pPr>
-        <ns0:spacing ns0:before="100" ns0:after="40"/>
-      </ns0:pPr>
-      <ns0:r>
-        <ns0:rPr>
-          <ns0:b/>
-          <ns0:color ns0:val="000000"/>
-          <ns0:sz ns0:val="20"/>
-        </ns0:rPr>
-        <ns0:t>Enterprise Payment Kiosk System (BerriosPay)</ns0:t>
-      </ns0:r>
-    </ns0:p>
-    <ns0:p>
-      <ns0:pPr>
-        <ns0:pStyle ns0:val="ListBullet"/>
-        <ns0:spacing ns0:before="0" ns0:after="20"/>
-        <ns0:ind ns0:left="432"/>
-      </ns0:pPr>
-      <ns0:r>
-        <ns0:rPr>
-          <ns0:color ns0:val="333333"/>
-          <ns0:sz ns0:val="19"/>
-        </ns0:rPr>
-        <ns0:t>Architected and delivered a full-stack payment platform in 3 calendar days using AI-directed phased implementation: React 19/TypeScript frontend, .NET 10/C# backend with clean architecture, WPF kiosk shell with WebView2, and Azure SQL database</ns0:t>
-      </ns0:r>
-    </ns0:p>
-    <ns0:p>
-      <ns0:pPr>
-        <ns0:pStyle ns0:val="ListBullet"/>
-        <ns0:spacing ns0:before="0" ns0:after="20"/>
-        <ns0:ind ns0:left="432"/>
-      </ns0:pPr>
-      <ns0:r>
-        <ns0:rPr>
-          <ns0:color ns0:val="333333"/>
-          <ns0:sz ns0:val="19"/>
-        </ns0:rPr>
-        <ns0:t>Architected a semi-integrated POS payment flow using PAX POSLink, decoupling PCI-sensitive card data from the Windows 10 IoT kiosk environment to minimize audit scope (PCI DSS SAQ A)</ns0:t>
-      </ns0:r>
-    </ns0:p>
-    <ns0:p>
-      <ns0:pPr>
-        <ns0:pStyle ns0:val="ListBullet"/>
-        <ns0:spacing ns0:before="0" ns0:after="20"/>
-        <ns0:ind ns0:left="432"/>
-      </ns0:pPr>
-      <ns0:r>
-        <ns0:rPr>
-          <ns0:color ns0:val="333333"/>
-          <ns0:sz ns0:val="19"/>
-        </ns0:rPr>
-        <ns0:t>Integrated Epson TM-M30II thermal printer and Touch Dynamic QK22 kiosk hardware via native WPF drivers</ns0:t>
-      </ns0:r>
-    </ns0:p>
-    <ns0:p>
-      <ns0:pPr>
-        <ns0:pStyle ns0:val="ListBullet"/>
-        <ns0:spacing ns0:before="0" ns0:after="20"/>
-        <ns0:ind ns0:left="432"/>
-      </ns0:pPr>
-      <ns0:r>
-        <ns0:rPr>
-          <ns0:color ns0:val="333333"/>
-          <ns0:sz ns0:val="19"/>
-        </ns0:rPr>
-        <ns0:t>Engineered a distributed idempotency strategy with SHA256 request signing, Polly-based circuit breakers, retry, and bulkhead isolation, ensuring zero duplicate transactions across 25+ high-volume kiosks</ns0:t>
-      </ns0:r>
-    </ns0:p>
-    <ns0:p>
-      <ns0:pPr>
-        <ns0:pStyle ns0:val="ListBullet"/>
-        <ns0:spacing ns0:before="0" ns0:after="20"/>
-        <ns0:ind ns0:left="432"/>
-      </ns0:pPr>
-      <ns0:r>
-        <ns0:rPr>
-          <ns0:color ns0:val="333333"/>
-          <ns0:sz ns0:val="19"/>
-        </ns0:rPr>
-        <ns0:t>Built offline queue with automatic sync recovery, enabling kiosks to continue operating during network outages</ns0:t>
-      </ns0:r>
-    </ns0:p>
-    <ns0:p>
-      <ns0:pPr>
-        <ns0:pStyle ns0:val="ListBullet"/>
-        <ns0:spacing ns0:before="0" ns0:after="20"/>
-        <ns0:ind ns0:left="432"/>
-      </ns0:pPr>
-      <ns0:r>
-        <ns0:rPr>
-          <ns0:color ns0:val="333333"/>
-          <ns0:sz ns0:val="19"/>
-        </ns0:rPr>
-        <ns0:t>Delivered bilingual (EN/ES) PWA with WCAG 2.1 AA accessibility, 48px touch targets for kiosk use</ns0:t>
-      </ns0:r>
-    </ns0:p>
-    <ns0:p>
-      <ns0:pPr>
-        <ns0:spacing ns0:before="100" ns0:after="40"/>
-      </ns0:pPr>
-      <ns0:r>
-        <ns0:rPr>
-          <ns0:b/>
-          <ns0:color ns0:val="000000"/>
-          <ns0:sz ns0:val="20"/>
-        </ns0:rPr>
-        <ns0:t>Medical Transport Logistics Platform (GoFleetCare)</ns0:t>
-      </ns0:r>
-    </ns0:p>
-    <ns0:p>
-      <ns0:pPr>
-        <ns0:pStyle ns0:val="ListBullet"/>
-        <ns0:spacing ns0:before="0" ns0:after="20"/>
-        <ns0:ind ns0:left="432"/>
-      </ns0:pPr>
-      <ns0:r>
-        <ns0:rPr>
-          <ns0:color ns0:val="333333"/>
-          <ns0:sz ns0:val="19"/>
-        </ns0:rPr>
-        <ns0:t>Architected and delivered two separate driver portals (GOFLEETCARE-WebApp and CDD-HUB-WebApp) for different user personas in the same HIPAA-adjacent medical transport ecosystem</ns0:t>
-      </ns0:r>
-    </ns0:p>
-    <ns0:p>
-      <ns0:pPr>
-        <ns0:pStyle ns0:val="ListBullet"/>
-        <ns0:spacing ns0:before="0" ns0:after="20"/>
-        <ns0:ind ns0:left="432"/>
-      </ns0:pPr>
-      <ns0:r>
-        <ns0:rPr>
-          <ns0:color ns0:val="333333"/>
-          <ns0:sz ns0:val="19"/>
-        </ns0:rPr>
-        <ns0:t>Built mobile-first driver portal with real-time trip management, geofencing, signature capture, and push notifications via Firebase</ns0:t>
-      </ns0:r>
-    </ns0:p>
-    <ns0:p>
-      <ns0:pPr>
-        <ns0:pStyle ns0:val="ListBullet"/>
-        <ns0:spacing ns0:before="0" ns0:after="20"/>
-        <ns0:ind ns0:left="432"/>
-      </ns0:pPr>
-      <ns0:r>
-        <ns0:rPr>
-          <ns0:color ns0:val="333333"/>
-          <ns0:sz ns0:val="19"/>
-        </ns0:rPr>
-        <ns0:t>Designed 13-state backend status flow mapped to 8 frontend states with client-side rate limiting (2s debounce, 10/min cap) to prevent status race conditions</ns0:t>
-      </ns0:r>
-    </ns0:p>
-    <ns0:p>
-      <ns0:pPr>
-        <ns0:pStyle ns0:val="ListBullet"/>
-        <ns0:spacing ns0:before="0" ns0:after="20"/>
-        <ns0:ind ns0:left="432"/>
-      </ns0:pPr>
-      <ns0:r>
-        <ns0:rPr>
-          <ns0:color ns0:val="333333"/>
-          <ns0:sz ns0:val="19"/>
-        </ns0:rPr>
-        <ns0:t>Implemented mutex-pattern token refresh to eliminate JWT race conditions across concurrent API calls</ns0:t>
-      </ns0:r>
-    </ns0:p>
-    <ns0:p>
-      <ns0:pPr>
-        <ns0:pStyle ns0:val="ListBullet"/>
-        <ns0:spacing ns0:before="0" ns0:after="20"/>
-        <ns0:ind ns0:left="432"/>
-      </ns0:pPr>
-      <ns0:r>
-        <ns0:rPr>
-          <ns0:color ns0:val="333333"/>
-          <ns0:sz ns0:val="19"/>
-        </ns0:rPr>
-        <ns0:t>Delivered offline mutation queue ensuring trip status updates survive connectivity loss and sync automatically on reconnect</ns0:t>
-      </ns0:r>
-    </ns0:p>
-    <ns0:p>
-      <ns0:pPr>
-        <ns0:pStyle ns0:val="ListBullet"/>
-        <ns0:spacing ns0:before="0" ns0:after="20"/>
-        <ns0:ind ns0:left="432"/>
-      </ns0:pPr>
-      <ns0:r>
-        <ns0:rPr>
-          <ns0:color ns0:val="333333"/>
-          <ns0:sz ns0:val="19"/>
-        </ns0:rPr>
-        <ns0:t>Implemented WebSocket real-time communication, PDF report generation, and dark mode across the driver portal suite</ns0:t>
-      </ns0:r>
-    </ns0:p>
-    <ns0:p>
-      <ns0:pPr>
-        <ns0:pStyle ns0:val="ListBullet"/>
-        <ns0:spacing ns0:before="0" ns0:after="20"/>
-        <ns0:ind ns0:left="432"/>
-      </ns0:pPr>
-      <ns0:r>
-        <ns0:rPr>
-          <ns0:color ns0:val="333333"/>
-          <ns0:sz ns0:val="19"/>
-        </ns0:rPr>
-        <ns0:t>Built comprehensive test suite growing from 91 to 215 tests during QA phase, covering unit, integration, and E2E scenarios</ns0:t>
-      </ns0:r>
-    </ns0:p>
-    <ns0:p>
-      <ns0:pPr>
-        <ns0:pStyle ns0:val="ListBullet"/>
-        <ns0:spacing ns0:before="0" ns0:after="20"/>
-        <ns0:ind ns0:left="432"/>
-      </ns0:pPr>
-      <ns0:r>
-        <ns0:rPr>
-          <ns0:color ns0:val="333333"/>
-          <ns0:sz ns0:val="19"/>
-        </ns0:rPr>
-        <ns0:t>Shipped CDD-HUB from first commit to production-deployed PWA with 215 automated tests in 3.5 weeks</ns0:t>
-      </ns0:r>
-    </ns0:p>
-    <ns0:p>
-      <ns0:pPr>
-        <ns0:spacing ns0:before="100" ns0:after="40"/>
-      </ns0:pPr>
-      <ns0:r>
-        <ns0:rPr>
-          <ns0:b/>
-          <ns0:color ns0:val="000000"/>
-          <ns0:sz ns0:val="20"/>
-        </ns0:rPr>
-        <ns0:t>Retail POS &amp; Distribution Systems (50+ Projects)</ns0:t>
-      </ns0:r>
-    </ns0:p>
-    <ns0:p>
-      <ns0:pPr>
-        <ns0:pStyle ns0:val="ListBullet"/>
-        <ns0:spacing ns0:before="0" ns0:after="20"/>
-        <ns0:ind ns0:left="432"/>
-      </ns0:pPr>
-      <ns0:r>
-        <ns0:rPr>
-          <ns0:color ns0:val="333333"/>
-          <ns0:sz ns0:val="19"/>
-        </ns0:rPr>
-        <ns0:t>Maintained and extended 50+ retail POS integrations across payment gateways (Evertec, Cayan, DynaPay), pharmacy systems, and e-commerce platforms (BigCommerce) with modular .NET connector services and RMS extensions</ns0:t>
-      </ns0:r>
-    </ns0:p>
-    <ns0:p>
-      <ns0:pPr>
-        <ns0:pStyle ns0:val="ListBullet"/>
-        <ns0:spacing ns0:before="0" ns0:after="20"/>
-        <ns0:ind ns0:left="432"/>
-      </ns0:pPr>
-      <ns0:r>
-        <ns0:rPr>
-          <ns0:color ns0:val="333333"/>
-          <ns0:sz ns0:val="19"/>
-        </ns0:rPr>
-        <ns0:t>Built tablet-based Ionic/Capacitor POS application (saludMedica) with cash checkout, membership management, and native hardware integration (Star Micronics printer, cash drawer) for Android deployment</ns0:t>
-      </ns0:r>
-    </ns0:p>
-    <ns0:p>
-      <ns0:pPr>
-        <ns0:spacing ns0:before="100" ns0:after="40"/>
-      </ns0:pPr>
-      <ns0:r>
-        <ns0:rPr>
-          <ns0:b/>
-          <ns0:color ns0:val="000000"/>
-          <ns0:sz ns0:val="20"/>
-        </ns0:rPr>
-        <ns0:t>AI-Assisted Delivery Workflow</ns0:t>
-      </ns0:r>
-    </ns0:p>
-    <ns0:p>
-      <ns0:pPr>
-        <ns0:pStyle ns0:val="ListBullet"/>
-        <ns0:spacing ns0:before="0" ns0:after="20"/>
-        <ns0:ind ns0:left="432"/>
-      </ns0:pPr>
-      <ns0:r>
-        <ns0:rPr>
-          <ns0:color ns0:val="333333"/>
-          <ns0:sz ns0:val="19"/>
-        </ns0:rPr>
-        <ns0:t>Designed and maintained structured AI-assisted development workflows, including project context files, phased build plans, custom commands, and automated code review pipelines for repeatable zero-to-production delivery</ns0:t>
-      </ns0:r>
-    </ns0:p>
-    <ns0:p>
-      <ns0:pPr>
-        <ns0:pStyle ns0:val="ListBullet"/>
-        <ns0:spacing ns0:before="0" ns0:after="20"/>
-        <ns0:ind ns0:left="432"/>
-      </ns0:pPr>
-      <ns0:r>
-        <ns0:rPr>
-          <ns0:color ns0:val="333333"/>
-          <ns0:sz ns0:val="19"/>
-        </ns0:rPr>
-        <ns0:t>Operate as architect, designer, developer, QA tester, and code reviewer in a single role, evaluating generated code for correctness, security, performance, and accessibility before every merge</ns0:t>
-      </ns0:r>
-    </ns0:p>
-    <ns0:p>
-      <ns0:pPr>
-        <ns0:pStyle ns0:val="ListBullet"/>
-        <ns0:spacing ns0:before="0" ns0:after="20"/>
-        <ns0:ind ns0:left="432"/>
-      </ns0:pPr>
-      <ns0:r>
-        <ns0:rPr>
-          <ns0:color ns0:val="333333"/>
-          <ns0:sz ns0:val="19"/>
-        </ns0:rPr>
-        <ns0:t>Reduced multi-month project timelines to weeks across 4 sequential production deployments in 6 months</ns0:t>
-      </ns0:r>
-    </ns0:p>
-    <ns0:p>
-      <ns0:pPr>
-        <ns0:pStyle ns0:val="ListBullet"/>
-        <ns0:spacing ns0:before="0" ns0:after="20"/>
-        <ns0:ind ns0:left="432"/>
-      </ns0:pPr>
-      <ns0:r>
-        <ns0:rPr>
-          <ns0:color ns0:val="333333"/>
-          <ns0:sz ns0:val="19"/>
-        </ns0:rPr>
-        <ns0:t>Accelerated personal delivery velocity from 9 commits/month to 54 commits/month over a 6-month period as the methodology matured</ns0:t>
-      </ns0:r>
-    </ns0:p>
-    <ns0:p>
-      <ns0:pPr>
-        <ns0:spacing ns0:before="160" ns0:after="20"/>
-      </ns0:pPr>
-      <ns0:r>
-        <ns0:rPr>
-          <ns0:b/>
-          <ns0:color ns0:val="000000"/>
-          <ns0:sz ns0:val="21"/>
-        </ns0:rPr>
-        <ns0:t>Highspring Digital</ns0:t>
-      </ns0:r>
-      <ns0:r>
-        <ns0:rPr>
-          <ns0:i/>
-          <ns0:color ns0:val="333333"/>
-          <ns0:sz ns0:val="21"/>
-        </ns0:rPr>
-        <ns0:t xml:space="preserve"> — Frontend Engineer</ns0:t>
-      </ns0:r>
-    </ns0:p>
-    <ns0:p>
-      <ns0:pPr>
-        <ns0:spacing ns0:before="0" ns0:after="60"/>
-      </ns0:pPr>
-      <ns0:r>
-        <ns0:rPr>
-          <ns0:i/>
-          <ns0:color ns0:val="555555"/>
-          <ns0:sz ns0:val="18"/>
-        </ns0:rPr>
-        <ns0:t>Remote | March 2025 – August 2025</ns0:t>
-      </ns0:r>
-    </ns0:p>
-    <ns0:p>
-      <ns0:pPr>
-        <ns0:pStyle ns0:val="ListBullet"/>
-        <ns0:spacing ns0:before="0" ns0:after="20"/>
-        <ns0:ind ns0:left="432"/>
-      </ns0:pPr>
-      <ns0:r>
-        <ns0:rPr>
-          <ns0:color ns0:val="333333"/>
-          <ns0:sz ns0:val="19"/>
-        </ns0:rPr>
-        <ns0:t>Built and optimized Angular/TypeScript client-facing web applications in Agile sprints</ns0:t>
-      </ns0:r>
-    </ns0:p>
-    <ns0:p>
-      <ns0:pPr>
-        <ns0:pStyle ns0:val="ListBullet"/>
-        <ns0:spacing ns0:before="0" ns0:after="20"/>
-        <ns0:ind ns0:left="432"/>
-      </ns0:pPr>
-      <ns0:r>
-        <ns0:rPr>
-          <ns0:color ns0:val="333333"/>
-          <ns0:sz ns0:val="19"/>
-        </ns0:rPr>
-        <ns0:t>Improved page load performance by 30% through lazy-loading implementation and state management optimization</ns0:t>
-      </ns0:r>
-    </ns0:p>
-    <ns0:p>
-      <ns0:pPr>
-        <ns0:pStyle ns0:val="ListBullet"/>
-        <ns0:spacing ns0:before="0" ns0:after="20"/>
-        <ns0:ind ns0:left="432"/>
-      </ns0:pPr>
-      <ns0:r>
-        <ns0:rPr>
-          <ns0:color ns0:val="333333"/>
-          <ns0:sz ns0:val="19"/>
-        </ns0:rPr>
-        <ns0:t>Ensured responsive design and accessibility compliance across multiple client projects</ns0:t>
-      </ns0:r>
-    </ns0:p>
-    <ns0:p>
-      <ns0:pPr>
-        <ns0:pStyle ns0:val="ListBullet"/>
-        <ns0:spacing ns0:before="0" ns0:after="20"/>
-        <ns0:ind ns0:left="432"/>
-      </ns0:pPr>
-      <ns0:r>
-        <ns0:rPr>
-          <ns0:color ns0:val="333333"/>
-          <ns0:sz ns0:val="19"/>
-        </ns0:rPr>
-        <ns0:t>Collaborated with backend engineers and designers to align data models with UI components</ns0:t>
-      </ns0:r>
-    </ns0:p>
-    <ns0:p>
-      <ns0:pPr>
-        <ns0:spacing ns0:before="160" ns0:after="20"/>
-      </ns0:pPr>
-      <ns0:r>
-        <ns0:rPr>
-          <ns0:b/>
-          <ns0:color ns0:val="000000"/>
-          <ns0:sz ns0:val="21"/>
-        </ns0:rPr>
-        <ns0:t>Dept. of Health of Puerto Rico</ns0:t>
-      </ns0:r>
-      <ns0:r>
-        <ns0:rPr>
-          <ns0:i/>
-          <ns0:color ns0:val="333333"/>
-          <ns0:sz ns0:val="21"/>
-        </ns0:rPr>
-        <ns0:t xml:space="preserve"> — Software Developer</ns0:t>
-      </ns0:r>
-    </ns0:p>
-    <ns0:p>
-      <ns0:pPr>
-        <ns0:spacing ns0:before="0" ns0:after="60"/>
-      </ns0:pPr>
-      <ns0:r>
-        <ns0:rPr>
-          <ns0:i/>
-          <ns0:color ns0:val="555555"/>
-          <ns0:sz ns0:val="18"/>
-        </ns0:rPr>
-        <ns0:t>Remote, PR | 2022 – March 2025</ns0:t>
-      </ns0:r>
-    </ns0:p>
-    <ns0:p>
-      <ns0:pPr>
-        <ns0:pStyle ns0:val="ListBullet"/>
-        <ns0:spacing ns0:before="0" ns0:after="20"/>
-        <ns0:ind ns0:left="432"/>
-      </ns0:pPr>
-      <ns0:r>
-        <ns0:rPr>
-          <ns0:color ns0:val="333333"/>
-          <ns0:sz ns0:val="19"/>
-        </ns0:rPr>
-        <ns0:t>Developed Angular-based features for internal public health platforms serving Puerto Rico's healthcare infrastructure</ns0:t>
-      </ns0:r>
-    </ns0:p>
-    <ns0:p>
-      <ns0:pPr>
-        <ns0:pStyle ns0:val="ListBullet"/>
-        <ns0:spacing ns0:before="0" ns0:after="20"/>
-        <ns0:ind ns0:left="432"/>
-      </ns0:pPr>
-      <ns0:r>
-        <ns0:rPr>
-          <ns0:color ns0:val="333333"/>
-          <ns0:sz ns0:val="19"/>
-        </ns0:rPr>
-        <ns0:t>Implemented JWT authentication and role-based authorization for HIPAA-adjacent security compliance</ns0:t>
-      </ns0:r>
-    </ns0:p>
-    <ns0:p>
-      <ns0:pPr>
-        <ns0:pStyle ns0:val="ListBullet"/>
-        <ns0:spacing ns0:before="0" ns0:after="20"/>
-        <ns0:ind ns0:left="432"/>
-      </ns0:pPr>
-      <ns0:r>
-        <ns0:rPr>
-          <ns0:color ns0:val="333333"/>
-          <ns0:sz ns0:val="19"/>
-        </ns0:rPr>
-        <ns0:t>Built data-driven features using SQL Server and Azure Data Studio for epidemiological reporting</ns0:t>
-      </ns0:r>
-    </ns0:p>
-    <ns0:p>
-      <ns0:pPr>
-        <ns0:pStyle ns0:val="ListBullet"/>
-        <ns0:spacing ns0:before="0" ns0:after="20"/>
-        <ns0:ind ns0:left="432"/>
-      </ns0:pPr>
-      <ns0:r>
-        <ns0:rPr>
-          <ns0:color ns0:val="333333"/>
-          <ns0:sz ns0:val="19"/>
-        </ns0:rPr>
-        <ns0:t>Contributed to CI/CD pipelines via GitLab and participated in Agile ceremonies and code reviews</ns0:t>
-      </ns0:r>
-    </ns0:p>
-    <ns0:p>
-      <ns0:pPr>
-        <ns0:spacing ns0:before="160" ns0:after="20"/>
-      </ns0:pPr>
-      <ns0:r>
-        <ns0:rPr>
-          <ns0:b/>
-          <ns0:color ns0:val="000000"/>
-          <ns0:sz ns0:val="21"/>
-        </ns0:rPr>
-        <ns0:t>Require Technology</ns0:t>
-      </ns0:r>
-      <ns0:r>
-        <ns0:rPr>
-          <ns0:i/>
-          <ns0:color ns0:val="333333"/>
-          <ns0:sz ns0:val="21"/>
-        </ns0:rPr>
-        <ns0:t xml:space="preserve"> — QA Associate / Software Developer</ns0:t>
-      </ns0:r>
-    </ns0:p>
-    <ns0:p>
-      <ns0:pPr>
-        <ns0:spacing ns0:before="0" ns0:after="60"/>
-      </ns0:pPr>
-      <ns0:r>
-        <ns0:rPr>
-          <ns0:i/>
-          <ns0:color ns0:val="555555"/>
-          <ns0:sz ns0:val="18"/>
-        </ns0:rPr>
-        <ns0:t>Remote, PR | 2022 – 2023</ns0:t>
-      </ns0:r>
-    </ns0:p>
-    <ns0:p>
-      <ns0:pPr>
-        <ns0:pStyle ns0:val="ListBullet"/>
-        <ns0:spacing ns0:before="0" ns0:after="20"/>
-        <ns0:ind ns0:left="432"/>
-      </ns0:pPr>
-      <ns0:r>
-        <ns0:rPr>
-          <ns0:color ns0:val="333333"/>
-          <ns0:sz ns0:val="19"/>
-        </ns0:rPr>
-        <ns0:t>Built React frontend components with reusable hooks and modern component patterns</ns0:t>
-      </ns0:r>
-    </ns0:p>
-    <ns0:p>
-      <ns0:pPr>
-        <ns0:pStyle ns0:val="ListBullet"/>
-        <ns0:spacing ns0:before="0" ns0:after="20"/>
-        <ns0:ind ns0:left="432"/>
-      </ns0:pPr>
-      <ns0:r>
-        <ns0:rPr>
-          <ns0:color ns0:val="333333"/>
-          <ns0:sz ns0:val="19"/>
-        </ns0:rPr>
-        <ns0:t>Led migration from Cypress to Playwright, improving cross-browser test stability and reducing E2E test execution time</ns0:t>
-      </ns0:r>
-    </ns0:p>
-    <ns0:p>
-      <ns0:pPr>
-        <ns0:pStyle ns0:val="ListBullet"/>
-        <ns0:spacing ns0:before="0" ns0:after="20"/>
-        <ns0:ind ns0:left="432"/>
-      </ns0:pPr>
-      <ns0:r>
-        <ns0:rPr>
-          <ns0:color ns0:val="333333"/>
-          <ns0:sz ns0:val="19"/>
-        </ns0:rPr>
-        <ns0:t>Supported cloud deployments on AWS and provided QA insights that improved release quality</ns0:t>
-      </ns0:r>
-    </ns0:p>
-    <ns0:p>
-      <ns0:pPr>
-        <ns0:spacing ns0:before="160" ns0:after="20"/>
-      </ns0:pPr>
-      <ns0:r>
-        <ns0:rPr>
-          <ns0:b/>
-          <ns0:color ns0:val="000000"/>
-          <ns0:sz ns0:val="21"/>
-        </ns0:rPr>
-        <ns0:t>Truenorth Corporation</ns0:t>
-      </ns0:r>
-      <ns0:r>
-        <ns0:rPr>
-          <ns0:i/>
-          <ns0:color ns0:val="333333"/>
-          <ns0:sz ns0:val="21"/>
-        </ns0:rPr>
-        <ns0:t xml:space="preserve"> — Software Developer I</ns0:t>
-      </ns0:r>
-    </ns0:p>
-    <ns0:p>
-      <ns0:pPr>
-        <ns0:spacing ns0:before="0" ns0:after="60"/>
-      </ns0:pPr>
-      <ns0:r>
-        <ns0:rPr>
-          <ns0:i/>
-          <ns0:color ns0:val="555555"/>
-          <ns0:sz ns0:val="18"/>
-        </ns0:rPr>
-        <ns0:t>Remote, PR | 2021 – 2022</ns0:t>
-      </ns0:r>
-    </ns0:p>
-    <ns0:p>
-      <ns0:pPr>
-        <ns0:pStyle ns0:val="ListBullet"/>
-        <ns0:spacing ns0:before="0" ns0:after="20"/>
-        <ns0:ind ns0:left="432"/>
-      </ns0:pPr>
-      <ns0:r>
-        <ns0:rPr>
-          <ns0:color ns0:val="333333"/>
-          <ns0:sz ns0:val="19"/>
-        </ns0:rPr>
-        <ns0:t>Developed .NET backend modules and SQL Server integrations for government-facing digital platforms</ns0:t>
-      </ns0:r>
-    </ns0:p>
-    <ns0:p>
-      <ns0:pPr>
-        <ns0:pStyle ns0:val="ListBullet"/>
-        <ns0:spacing ns0:before="0" ns0:after="20"/>
-        <ns0:ind ns0:left="432"/>
-      </ns0:pPr>
-      <ns0:r>
-        <ns0:rPr>
-          <ns0:color ns0:val="333333"/>
-          <ns0:sz ns0:val="19"/>
-        </ns0:rPr>
-        <ns0:t>Implemented automated deployment pipelines using Azure DevOps</ns0:t>
-      </ns0:r>
-    </ns0:p>
-    <ns0:p>
-      <ns0:pPr>
-        <ns0:pStyle ns0:val="ListBullet"/>
-        <ns0:spacing ns0:before="0" ns0:after="20"/>
-        <ns0:ind ns0:left="432"/>
-      </ns0:pPr>
-      <ns0:r>
-        <ns0:rPr>
-          <ns0:color ns0:val="333333"/>
-          <ns0:sz ns0:val="19"/>
-        </ns0:rPr>
-        <ns0:t>Collaborated cross-functionally with designers and QA to ensure consistency and scalability</ns0:t>
-      </ns0:r>
-    </ns0:p>
-    <ns0:p>
-      <ns0:pPr>
-        <ns0:spacing ns0:before="200" ns0:after="80"/>
-        <ns0:pBdr>
-          <ns0:bottom ns0:val="single" ns0:sz="4" ns0:space="1" ns0:color="1F4E79"/>
-        </ns0:pBdr>
-      </ns0:pPr>
-      <ns0:r>
-        <ns0:rPr>
-          <ns0:b/>
-          <ns0:color ns0:val="1F4E79"/>
-          <ns0:sz ns0:val="22"/>
-        </ns0:rPr>
-        <ns0:t>EDUCATION</ns0:t>
-      </ns0:r>
-    </ns0:p>
-    <ns0:p>
-      <ns0:pPr>
-        <ns0:spacing ns0:before="40" ns0:after="20"/>
-      </ns0:pPr>
-      <ns0:r>
-        <ns0:rPr>
-          <ns0:b/>
-          <ns0:color ns0:val="000000"/>
-          <ns0:sz ns0:val="20"/>
-        </ns0:rPr>
-        <ns0:t>Associate's Degree - Computer Science</ns0:t>
-      </ns0:r>
-    </ns0:p>
-    <ns0:p>
-      <ns0:pPr>
-        <ns0:spacing ns0:before="0"/>
-      </ns0:pPr>
-      <ns0:r>
-        <ns0:rPr>
-          <ns0:color ns0:val="555555"/>
-          <ns0:sz ns0:val="19"/>
-        </ns0:rPr>
-        <ns0:t>University of Puerto Rico | 2023 – 2025</ns0:t>
-      </ns0:r>
-    </ns0:p>
-    <ns0:p>
-      <ns0:pPr>
-        <ns0:spacing ns0:before="200" ns0:after="80"/>
-        <ns0:pBdr>
-          <ns0:bottom ns0:val="single" ns0:sz="4" ns0:space="1" ns0:color="1F4E79"/>
-        </ns0:pBdr>
-      </ns0:pPr>
-      <ns0:r>
-        <ns0:rPr>
-          <ns0:b/>
-          <ns0:color ns0:val="1F4E79"/>
-          <ns0:sz ns0:val="22"/>
-        </ns0:rPr>
-        <ns0:t/>
-      </ns0:r>
-    </ns0:p>
-    <ns0:p>
-      <ns0:pPr>
-        <ns0:pStyle ns0:val="ListBullet"/>
-        <ns0:spacing ns0:before="0" ns0:after="20"/>
-        <ns0:ind ns0:left="432"/>
-      </ns0:pPr>
-      <ns0:r>
-        <ns0:rPr>
-          <ns0:b/>
-          <ns0:color ns0:val="333333"/>
-          <ns0:sz ns0:val="19"/>
-        </ns0:rPr>
-        <ns0:t xml:space="preserve"/>
-      </ns0:r>
-      <ns0:r>
-        <ns0:rPr>
-          <ns0:color ns0:val="333333"/>
-          <ns0:sz ns0:val="19"/>
-        </ns0:rPr>
-        <ns0:t/>
-      </ns0:r>
-    </ns0:p>
-    <ns0:p>
-      <ns0:pPr>
-        <ns0:pStyle ns0:val="ListBullet"/>
-        <ns0:spacing ns0:before="0" ns0:after="20"/>
-        <ns0:ind ns0:left="432"/>
-      </ns0:pPr>
-      <ns0:r>
-        <ns0:rPr>
-          <ns0:b/>
-          <ns0:color ns0:val="333333"/>
-          <ns0:sz ns0:val="19"/>
-        </ns0:rPr>
-        <ns0:t xml:space="preserve"/>
-      </ns0:r>
-      <ns0:r>
-        <ns0:rPr>
-          <ns0:color ns0:val="333333"/>
-          <ns0:sz ns0:val="19"/>
-        </ns0:rPr>
-        <ns0:t/>
-      </ns0:r>
-    </ns0:p>
-    <ns0:p>
-      <ns0:pPr>
-        <ns0:pStyle ns0:val="ListBullet"/>
-        <ns0:spacing ns0:before="0" ns0:after="20"/>
-        <ns0:ind ns0:left="432"/>
-      </ns0:pPr>
-      <ns0:r>
-        <ns0:rPr>
-          <ns0:b/>
-          <ns0:color ns0:val="333333"/>
-          <ns0:sz ns0:val="19"/>
-        </ns0:rPr>
-        <ns0:t xml:space="preserve"/>
-      </ns0:r>
-      <ns0:r>
-        <ns0:rPr>
-          <ns0:color ns0:val="333333"/>
-          <ns0:sz ns0:val="19"/>
-        </ns0:rPr>
-        <ns0:t/>
-      </ns0:r>
-    </ns0:p>
-    <ns0:p>
-      <ns0:pPr>
-        <ns0:pStyle ns0:val="ListBullet"/>
-        <ns0:spacing ns0:before="0" ns0:after="20"/>
-        <ns0:ind ns0:left="432"/>
-      </ns0:pPr>
-      <ns0:r>
-        <ns0:rPr>
-          <ns0:b/>
-          <ns0:color ns0:val="333333"/>
-          <ns0:sz ns0:val="19"/>
-        </ns0:rPr>
-        <ns0:t xml:space="preserve"/>
-      </ns0:r>
-      <ns0:r>
-        <ns0:rPr>
-          <ns0:color ns0:val="333333"/>
-          <ns0:sz ns0:val="19"/>
-        </ns0:rPr>
-        <ns0:t/>
-      </ns0:r>
-    </ns0:p>
-    <ns0:p>
-      <ns0:pPr>
-        <ns0:pStyle ns0:val="ListBullet"/>
-        <ns0:spacing ns0:before="0" ns0:after="20"/>
-        <ns0:ind ns0:left="432"/>
-      </ns0:pPr>
-      <ns0:r>
-        <ns0:rPr>
-          <ns0:b/>
-          <ns0:color ns0:val="333333"/>
-          <ns0:sz ns0:val="19"/>
-        </ns0:rPr>
-        <ns0:t xml:space="preserve"/>
-      </ns0:r>
-      <ns0:r>
-        <ns0:rPr>
-          <ns0:color ns0:val="333333"/>
-          <ns0:sz ns0:val="19"/>
-        </ns0:rPr>
-        <ns0:t/>
-      </ns0:r>
-    </ns0:p>
-    <ns0:p>
-      <ns0:pPr>
-        <ns0:pStyle ns0:val="ListBullet"/>
-        <ns0:spacing ns0:before="0" ns0:after="20"/>
-        <ns0:ind ns0:left="432"/>
-      </ns0:pPr>
-      <ns0:r>
-        <ns0:rPr>
-          <ns0:b/>
-          <ns0:color ns0:val="333333"/>
-          <ns0:sz ns0:val="19"/>
-        </ns0:rPr>
-        <ns0:t xml:space="preserve"/>
-      </ns0:r>
-      <ns0:r>
-        <ns0:rPr>
-          <ns0:color ns0:val="333333"/>
-          <ns0:sz ns0:val="19"/>
-        </ns0:rPr>
-        <ns0:t/>
-      </ns0:r>
-    </ns0:p>
-    <ns0:p>
-      <ns0:pPr>
-        <ns0:pStyle ns0:val="ListBullet"/>
-        <ns0:spacing ns0:before="0" ns0:after="20"/>
-        <ns0:ind ns0:left="432"/>
-      </ns0:pPr>
-      <ns0:r>
-        <ns0:rPr>
-          <ns0:b/>
-          <ns0:color ns0:val="333333"/>
-          <ns0:sz ns0:val="19"/>
-        </ns0:rPr>
-        <ns0:t xml:space="preserve"/>
-      </ns0:r>
-      <ns0:r>
-        <ns0:rPr>
-          <ns0:color ns0:val="333333"/>
-          <ns0:sz ns0:val="19"/>
-        </ns0:rPr>
-        <ns0:t/>
-      </ns0:r>
-    </ns0:p>
-    <ns0:sectPr ns0:rsidR="00FC693F" ns0:rsidRPr="0006063C" ns0:rsidSect="00034616">
-      <ns0:pgSz ns0:w="12240" ns0:h="15840"/>
-      <ns0:pgMar ns0:top="720" ns0:right="864" ns0:bottom="720" ns0:left="864" ns0:header="720" ns0:footer="720" ns0:gutter="0"/>
-      <ns0:cols ns0:space="720"/>
-      <ns0:docGrid ns0:linePitch="360"/>
-    </ns0:sectPr>
-  </ns0:body>
-</ns0:document>
+<w:document xmlns:wpc="http://schemas.microsoft.com/office/word/2010/wordprocessingCanvas" xmlns:mo="http://schemas.microsoft.com/office/mac/office/2008/main" xmlns:mc="http://schemas.openxmlformats.org/markup-compatibility/2006" xmlns:mv="urn:schemas-microsoft-com:mac:vml" xmlns:o="urn:schemas-microsoft-com:office:office" xmlns:r="http://schemas.openxmlformats.org/officeDocument/2006/relationships" xmlns:m="http://schemas.openxmlformats.org/officeDocument/2006/math" xmlns:v="urn:schemas-microsoft-com:vml" xmlns:wp14="http://schemas.microsoft.com/office/word/2010/wordprocessingDrawing" xmlns:wp="http://schemas.openxmlformats.org/drawingml/2006/wordprocessingDrawing" xmlns:w10="urn:schemas-microsoft-com:office:word" xmlns:w="http://schemas.openxmlformats.org/wordprocessingml/2006/main" xmlns:w14="http://schemas.microsoft.com/office/word/2010/wordml" xmlns:wpg="http://schemas.microsoft.com/office/word/2010/wordprocessingGroup" xmlns:wpi="http://schemas.microsoft.com/office/word/2010/wordprocessingInk" xmlns:wne="http://schemas.microsoft.com/office/word/2006/wordml" xmlns:wps="http://schemas.microsoft.com/office/word/2010/wordprocessingShape" mc:Ignorable="w14 wp14">
+  <w:body>
+    <w:p>
+      <w:pPr>
+        <w:spacing w:after="20"/>
+        <w:jc w:val="center"/>
+      </w:pPr>
+      <w:r>
+        <w:rPr>
+          <w:b/>
+          <w:color w:val="000000"/>
+          <w:sz w:val="48"/>
+        </w:rPr>
+        <w:t>Luis Rodríguez</w:t>
+      </w:r>
+    </w:p>
+    <w:p>
+      <w:pPr>
+        <w:spacing w:after="0"/>
+        <w:jc w:val="center"/>
+      </w:pPr>
+      <w:r>
+        <w:rPr>
+          <w:color w:val="444444"/>
+          <w:sz w:val="17"/>
+        </w:rPr>
+        <w:t>787-980-5868 | luisangelrod17@gmail.com | Toa Alta, Puerto Rico | US Citizen</w:t>
+      </w:r>
+    </w:p>
+    <w:p>
+      <w:pPr>
+        <w:spacing w:after="40"/>
+        <w:jc w:val="center"/>
+      </w:pPr>
+      <w:r>
+        <w:rPr>
+          <w:color w:val="444444"/>
+          <w:sz w:val="17"/>
+        </w:rPr>
+        <w:t>LinkedIn: linkedin.com/in/luis-rodriguez-515858bb | Portfolio: luisrodriguezdev.netlify.app | GitHub: github.com/luisangelrod</w:t>
+      </w:r>
+    </w:p>
+    <w:p>
+      <w:pPr>
+        <w:spacing w:before="160" w:after="60"/>
+        <w:pBdr>
+          <w:bottom w:val="single" w:sz="6" w:space="1" w:color="000000"/>
+        </w:pBdr>
+      </w:pPr>
+      <w:r>
+        <w:rPr>
+          <w:b/>
+          <w:color w:val="000000"/>
+          <w:sz w:val="20"/>
+        </w:rPr>
+        <w:t>Skills</w:t>
+      </w:r>
+    </w:p>
+    <w:p>
+      <w:pPr>
+        <w:spacing w:before="0" w:after="20"/>
+      </w:pPr>
+      <w:r>
+        <w:rPr>
+          <w:b/>
+          <w:color w:val="000000"/>
+          <w:sz w:val="18"/>
+        </w:rPr>
+        <w:t xml:space="preserve">Frontend: </w:t>
+      </w:r>
+      <w:r>
+        <w:rPr>
+          <w:color w:val="1A1A1A"/>
+          <w:sz w:val="18"/>
+        </w:rPr>
+        <w:t>React 19, TypeScript, Angular, Ionic 8, Vite, TailwindCSS 4, TanStack Query, Zustand, Zod, i18next</w:t>
+      </w:r>
+    </w:p>
+    <w:p>
+      <w:pPr>
+        <w:spacing w:before="0" w:after="20"/>
+      </w:pPr>
+      <w:r>
+        <w:rPr>
+          <w:b/>
+          <w:color w:val="000000"/>
+          <w:sz w:val="18"/>
+        </w:rPr>
+        <w:t xml:space="preserve">Backend: </w:t>
+      </w:r>
+      <w:r>
+        <w:rPr>
+          <w:color w:val="1A1A1A"/>
+          <w:sz w:val="18"/>
+        </w:rPr>
+        <w:t>.NET 10, C#, ASP.NET Core, Entity Framework Core, Node.js, REST APIs, Minimal APIs, SQL Server, Azure SQL</w:t>
+      </w:r>
+    </w:p>
+    <w:p>
+      <w:pPr>
+        <w:spacing w:before="0" w:after="20"/>
+      </w:pPr>
+      <w:r>
+        <w:rPr>
+          <w:b/>
+          <w:color w:val="000000"/>
+          <w:sz w:val="18"/>
+        </w:rPr>
+        <w:t xml:space="preserve">Cloud &amp; DevOps: </w:t>
+      </w:r>
+      <w:r>
+        <w:rPr>
+          <w:color w:val="1A1A1A"/>
+          <w:sz w:val="18"/>
+        </w:rPr>
+        <w:t>Azure (App Service, SQL, Static Web Apps, Key Vault), GitHub Actions, GitLab CI/CD, Azure DevOps, Bicep IaC, AWS</w:t>
+      </w:r>
+    </w:p>
+    <w:p>
+      <w:pPr>
+        <w:spacing w:before="0" w:after="20"/>
+      </w:pPr>
+      <w:r>
+        <w:rPr>
+          <w:b/>
+          <w:color w:val="000000"/>
+          <w:sz w:val="18"/>
+        </w:rPr>
+        <w:t xml:space="preserve">Mobile/Desktop: </w:t>
+      </w:r>
+      <w:r>
+        <w:rPr>
+          <w:color w:val="1A1A1A"/>
+          <w:sz w:val="18"/>
+        </w:rPr>
+        <w:t>Ionic + Capacitor (iOS/Android), WPF + WebView2 (Kiosk), Progressive Web Apps</w:t>
+      </w:r>
+    </w:p>
+    <w:p>
+      <w:pPr>
+        <w:spacing w:before="0" w:after="20"/>
+      </w:pPr>
+      <w:r>
+        <w:rPr>
+          <w:b/>
+          <w:color w:val="000000"/>
+          <w:sz w:val="18"/>
+        </w:rPr>
+        <w:t xml:space="preserve">AI Tooling: </w:t>
+      </w:r>
+      <w:r>
+        <w:rPr>
+          <w:color w:val="1A1A1A"/>
+          <w:sz w:val="18"/>
+        </w:rPr>
+        <w:t>Claude Code, ChatGPT/Codex, Gemini, Grok, NotebookLM, CLAUDE.md context engineering, AI code review pipelines</w:t>
+      </w:r>
+    </w:p>
+    <w:p>
+      <w:pPr>
+        <w:spacing w:before="0" w:after="20"/>
+      </w:pPr>
+      <w:r>
+        <w:rPr>
+          <w:b/>
+          <w:color w:val="000000"/>
+          <w:sz w:val="18"/>
+        </w:rPr>
+        <w:t xml:space="preserve">Testing: </w:t>
+      </w:r>
+      <w:r>
+        <w:rPr>
+          <w:color w:val="1A1A1A"/>
+          <w:sz w:val="18"/>
+        </w:rPr>
+        <w:t>Vitest, Playwright E2E, Jest, Cypress | Security: JWT, RBAC, PCI DSS, WCAG 2.1 AA</w:t>
+      </w:r>
+    </w:p>
+    <w:p>
+      <w:pPr>
+        <w:spacing w:before="160" w:after="60"/>
+        <w:pBdr>
+          <w:bottom w:val="single" w:sz="6" w:space="1" w:color="000000"/>
+        </w:pBdr>
+      </w:pPr>
+      <w:r>
+        <w:rPr>
+          <w:b/>
+          <w:color w:val="000000"/>
+          <w:sz w:val="20"/>
+        </w:rPr>
+        <w:t>Experience</w:t>
+      </w:r>
+    </w:p>
+    <w:p>
+      <w:pPr>
+        <w:tabs>
+          <w:tab w:pos="9216" w:val="right"/>
+        </w:tabs>
+        <w:spacing w:before="120" w:after="0"/>
+      </w:pPr>
+      <w:r>
+        <w:rPr>
+          <w:b/>
+          <w:color w:val="000000"/>
+          <w:sz w:val="19"/>
+        </w:rPr>
+        <w:t>BCPOS — Remote / Bayamon, PR</w:t>
+      </w:r>
+      <w:r>
+        <w:tab/>
+      </w:r>
+      <w:r>
+        <w:rPr>
+          <w:color w:val="000000"/>
+          <w:sz w:val="18"/>
+        </w:rPr>
+        <w:t>September 2025 – Present</w:t>
+      </w:r>
+    </w:p>
+    <w:p>
+      <w:pPr>
+        <w:spacing w:before="0" w:after="40"/>
+      </w:pPr>
+      <w:r>
+        <w:rPr>
+          <w:i/>
+          <w:color w:val="444444"/>
+          <w:sz w:val="19"/>
+        </w:rPr>
+        <w:t>Systems Architect &amp; AI-Augmented Engineering Lead</w:t>
+      </w:r>
+    </w:p>
+    <w:p>
+      <w:pPr>
+        <w:pStyle w:val="ListBullet"/>
+        <w:spacing w:before="0" w:after="20"/>
+        <w:ind w:left="360"/>
+      </w:pPr>
+      <w:r>
+        <w:rPr>
+          <w:color w:val="1A1A1A"/>
+          <w:sz w:val="18"/>
+        </w:rPr>
+        <w:t>Promoted from mid-level to systems architect within 3 months; sole technical decision-maker across 50+ active projects</w:t>
+      </w:r>
+    </w:p>
+    <w:p>
+      <w:pPr>
+        <w:pStyle w:val="ListBullet"/>
+        <w:spacing w:before="0" w:after="20"/>
+        <w:ind w:left="360"/>
+      </w:pPr>
+      <w:r>
+        <w:rPr>
+          <w:color w:val="1A1A1A"/>
+          <w:sz w:val="18"/>
+        </w:rPr>
+        <w:t>Designed AI-directed development workflow (CLAUDE.md, 7-phase plans, automated reviews), increasing delivery velocity 6x — from 9 to 54 commits/month</w:t>
+      </w:r>
+    </w:p>
+    <w:p>
+      <w:pPr>
+        <w:pStyle w:val="ListBullet"/>
+        <w:spacing w:before="0" w:after="20"/>
+        <w:ind w:left="360"/>
+      </w:pPr>
+      <w:r>
+        <w:rPr>
+          <w:color w:val="1A1A1A"/>
+          <w:sz w:val="18"/>
+        </w:rPr>
+        <w:t>Shipped 4 production systems in 6 months as sole engineer, each from database schema to cloud deployment</w:t>
+      </w:r>
+    </w:p>
+    <w:p>
+      <w:pPr>
+        <w:spacing w:before="80" w:after="20"/>
+      </w:pPr>
+      <w:r>
+        <w:rPr>
+          <w:i/>
+          <w:color w:val="000000"/>
+          <w:sz w:val="19"/>
+        </w:rPr>
+        <w:t>Enterprise Payment Kiosk System (BerriosPay)</w:t>
+      </w:r>
+    </w:p>
+    <w:p>
+      <w:pPr>
+        <w:pStyle w:val="ListBullet"/>
+        <w:spacing w:before="0" w:after="20"/>
+        <w:ind w:left="360"/>
+      </w:pPr>
+      <w:r>
+        <w:rPr>
+          <w:color w:val="1A1A1A"/>
+          <w:sz w:val="18"/>
+        </w:rPr>
+        <w:t>Architected full-stack payment platform in 3 days: React 19 frontend, .NET 10 backend, WPF kiosk shell, Azure SQL — deployed across 25+ kiosks</w:t>
+      </w:r>
+    </w:p>
+    <w:p>
+      <w:pPr>
+        <w:pStyle w:val="ListBullet"/>
+        <w:spacing w:before="0" w:after="20"/>
+        <w:ind w:left="360"/>
+      </w:pPr>
+      <w:r>
+        <w:rPr>
+          <w:color w:val="1A1A1A"/>
+          <w:sz w:val="18"/>
+        </w:rPr>
+        <w:t>Engineered SHA256 idempotency with Polly circuit breakers, ensuring zero duplicate transactions across high-volume kiosks</w:t>
+      </w:r>
+    </w:p>
+    <w:p>
+      <w:pPr>
+        <w:pStyle w:val="ListBullet"/>
+        <w:spacing w:before="0" w:after="20"/>
+        <w:ind w:left="360"/>
+      </w:pPr>
+      <w:r>
+        <w:rPr>
+          <w:color w:val="1A1A1A"/>
+          <w:sz w:val="18"/>
+        </w:rPr>
+        <w:t>Built offline queue with auto-sync recovery, enabling kiosks to operate during network outages</w:t>
+      </w:r>
+    </w:p>
+    <w:p>
+      <w:pPr>
+        <w:pStyle w:val="ListBullet"/>
+        <w:spacing w:before="0" w:after="20"/>
+        <w:ind w:left="360"/>
+      </w:pPr>
+      <w:r>
+        <w:rPr>
+          <w:color w:val="1A1A1A"/>
+          <w:sz w:val="18"/>
+        </w:rPr>
+        <w:t>Resolved 11 security vulnerabilities in one audit cycle; maintained 43 automated tests with zero failures</w:t>
+      </w:r>
+    </w:p>
+    <w:p>
+      <w:pPr>
+        <w:spacing w:before="80" w:after="20"/>
+      </w:pPr>
+      <w:r>
+        <w:rPr>
+          <w:i/>
+          <w:color w:val="000000"/>
+          <w:sz w:val="19"/>
+        </w:rPr>
+        <w:t>Medical Transport Logistics Platform (GoFleetCare + CDD-HUB)</w:t>
+      </w:r>
+    </w:p>
+    <w:p>
+      <w:pPr>
+        <w:pStyle w:val="ListBullet"/>
+        <w:spacing w:before="0" w:after="20"/>
+        <w:ind w:left="360"/>
+      </w:pPr>
+      <w:r>
+        <w:rPr>
+          <w:color w:val="1A1A1A"/>
+          <w:sz w:val="18"/>
+        </w:rPr>
+        <w:t>Architected two HIPAA-adjacent driver portals with real-time trip management, geofencing, and signature capture</w:t>
+      </w:r>
+    </w:p>
+    <w:p>
+      <w:pPr>
+        <w:pStyle w:val="ListBullet"/>
+        <w:spacing w:before="0" w:after="20"/>
+        <w:ind w:left="360"/>
+      </w:pPr>
+      <w:r>
+        <w:rPr>
+          <w:color w:val="1A1A1A"/>
+          <w:sz w:val="18"/>
+        </w:rPr>
+        <w:t>Designed 13-state status flow with rate limiting (2s debounce, 10/min cap), eliminating status race conditions</w:t>
+      </w:r>
+    </w:p>
+    <w:p>
+      <w:pPr>
+        <w:pStyle w:val="ListBullet"/>
+        <w:spacing w:before="0" w:after="20"/>
+        <w:ind w:left="360"/>
+      </w:pPr>
+      <w:r>
+        <w:rPr>
+          <w:color w:val="1A1A1A"/>
+          <w:sz w:val="18"/>
+        </w:rPr>
+        <w:t>Shipped CDD-HUB from first commit to production PWA with 215 automated tests in 3.5 weeks</w:t>
+      </w:r>
+    </w:p>
+    <w:p>
+      <w:pPr>
+        <w:pStyle w:val="ListBullet"/>
+        <w:spacing w:before="0" w:after="20"/>
+        <w:ind w:left="360"/>
+      </w:pPr>
+      <w:r>
+        <w:rPr>
+          <w:color w:val="1A1A1A"/>
+          <w:sz w:val="18"/>
+        </w:rPr>
+        <w:t>Built offline mutation queue ensuring trip updates survive connectivity loss and sync automatically</w:t>
+      </w:r>
+    </w:p>
+    <w:p>
+      <w:pPr>
+        <w:spacing w:before="80" w:after="20"/>
+      </w:pPr>
+      <w:r>
+        <w:rPr>
+          <w:i/>
+          <w:color w:val="000000"/>
+          <w:sz w:val="19"/>
+        </w:rPr>
+        <w:t>Retail POS &amp; Distribution Systems (50+ Projects)</w:t>
+      </w:r>
+    </w:p>
+    <w:p>
+      <w:pPr>
+        <w:pStyle w:val="ListBullet"/>
+        <w:spacing w:before="0" w:after="20"/>
+        <w:ind w:left="360"/>
+      </w:pPr>
+      <w:r>
+        <w:rPr>
+          <w:color w:val="1A1A1A"/>
+          <w:sz w:val="18"/>
+        </w:rPr>
+        <w:t>Maintained 50+ retail POS integrations across payment gateways (Evertec, Cayan, DynaPay), pharmacy systems, and BigCommerce</w:t>
+      </w:r>
+    </w:p>
+    <w:p>
+      <w:pPr>
+        <w:pStyle w:val="ListBullet"/>
+        <w:spacing w:before="0" w:after="20"/>
+        <w:ind w:left="360"/>
+      </w:pPr>
+      <w:r>
+        <w:rPr>
+          <w:color w:val="1A1A1A"/>
+          <w:sz w:val="18"/>
+        </w:rPr>
+        <w:t>Built tablet Ionic/Capacitor POS (Salud Medica) with native hardware integration (Star Micronics printer, cash drawer)</w:t>
+      </w:r>
+    </w:p>
+    <w:p>
+      <w:pPr>
+        <w:tabs>
+          <w:tab w:pos="9216" w:val="right"/>
+        </w:tabs>
+        <w:spacing w:before="120" w:after="0"/>
+      </w:pPr>
+      <w:r>
+        <w:rPr>
+          <w:b/>
+          <w:color w:val="000000"/>
+          <w:sz w:val="19"/>
+        </w:rPr>
+        <w:t>Highspring Digital — Remote</w:t>
+      </w:r>
+      <w:r>
+        <w:tab/>
+      </w:r>
+      <w:r>
+        <w:rPr>
+          <w:color w:val="000000"/>
+          <w:sz w:val="18"/>
+        </w:rPr>
+        <w:t>March 2025 – August 2025</w:t>
+      </w:r>
+    </w:p>
+    <w:p>
+      <w:pPr>
+        <w:spacing w:before="0" w:after="40"/>
+      </w:pPr>
+      <w:r>
+        <w:rPr>
+          <w:i/>
+          <w:color w:val="444444"/>
+          <w:sz w:val="19"/>
+        </w:rPr>
+        <w:t>Frontend Engineer</w:t>
+      </w:r>
+    </w:p>
+    <w:p>
+      <w:pPr>
+        <w:pStyle w:val="ListBullet"/>
+        <w:spacing w:before="0" w:after="20"/>
+        <w:ind w:left="360"/>
+      </w:pPr>
+      <w:r>
+        <w:rPr>
+          <w:color w:val="1A1A1A"/>
+          <w:sz w:val="18"/>
+        </w:rPr>
+        <w:t>Built and optimized Angular/TypeScript web applications in Agile sprints across multiple client engagements</w:t>
+      </w:r>
+    </w:p>
+    <w:p>
+      <w:pPr>
+        <w:pStyle w:val="ListBullet"/>
+        <w:spacing w:before="0" w:after="20"/>
+        <w:ind w:left="360"/>
+      </w:pPr>
+      <w:r>
+        <w:rPr>
+          <w:color w:val="1A1A1A"/>
+          <w:sz w:val="18"/>
+        </w:rPr>
+        <w:t>Improved page load performance by 30% through lazy-loading and state management optimization</w:t>
+      </w:r>
+    </w:p>
+    <w:p>
+      <w:pPr>
+        <w:pStyle w:val="ListBullet"/>
+        <w:spacing w:before="0" w:after="20"/>
+        <w:ind w:left="360"/>
+      </w:pPr>
+      <w:r>
+        <w:rPr>
+          <w:color w:val="1A1A1A"/>
+          <w:sz w:val="18"/>
+        </w:rPr>
+        <w:t>Delivered responsive, WCAG-accessible designs, reducing client-reported UI defects</w:t>
+      </w:r>
+    </w:p>
+    <w:p>
+      <w:pPr>
+        <w:tabs>
+          <w:tab w:pos="9216" w:val="right"/>
+        </w:tabs>
+        <w:spacing w:before="120" w:after="0"/>
+      </w:pPr>
+      <w:r>
+        <w:rPr>
+          <w:b/>
+          <w:color w:val="000000"/>
+          <w:sz w:val="19"/>
+        </w:rPr>
+        <w:t>Dept. of Health of Puerto Rico — Remote, PR</w:t>
+      </w:r>
+      <w:r>
+        <w:tab/>
+      </w:r>
+      <w:r>
+        <w:rPr>
+          <w:color w:val="000000"/>
+          <w:sz w:val="18"/>
+        </w:rPr>
+        <w:t>2022 – March 2025</w:t>
+      </w:r>
+    </w:p>
+    <w:p>
+      <w:pPr>
+        <w:spacing w:before="0" w:after="40"/>
+      </w:pPr>
+      <w:r>
+        <w:rPr>
+          <w:i/>
+          <w:color w:val="444444"/>
+          <w:sz w:val="19"/>
+        </w:rPr>
+        <w:t>Software Developer</w:t>
+      </w:r>
+    </w:p>
+    <w:p>
+      <w:pPr>
+        <w:pStyle w:val="ListBullet"/>
+        <w:spacing w:before="0" w:after="20"/>
+        <w:ind w:left="360"/>
+      </w:pPr>
+      <w:r>
+        <w:rPr>
+          <w:color w:val="1A1A1A"/>
+          <w:sz w:val="18"/>
+        </w:rPr>
+        <w:t>Developed Angular features for public health platforms serving PR healthcare infrastructure</w:t>
+      </w:r>
+    </w:p>
+    <w:p>
+      <w:pPr>
+        <w:pStyle w:val="ListBullet"/>
+        <w:spacing w:before="0" w:after="20"/>
+        <w:ind w:left="360"/>
+      </w:pPr>
+      <w:r>
+        <w:rPr>
+          <w:color w:val="1A1A1A"/>
+          <w:sz w:val="18"/>
+        </w:rPr>
+        <w:t>Implemented JWT authentication and RBAC for HIPAA-adjacent security compliance</w:t>
+      </w:r>
+    </w:p>
+    <w:p>
+      <w:pPr>
+        <w:pStyle w:val="ListBullet"/>
+        <w:spacing w:before="0" w:after="20"/>
+        <w:ind w:left="360"/>
+      </w:pPr>
+      <w:r>
+        <w:rPr>
+          <w:color w:val="1A1A1A"/>
+          <w:sz w:val="18"/>
+        </w:rPr>
+        <w:t>Automated epidemiological reporting with SQL Server, reducing manual data processing time</w:t>
+      </w:r>
+    </w:p>
+    <w:p>
+      <w:pPr>
+        <w:tabs>
+          <w:tab w:pos="9216" w:val="right"/>
+        </w:tabs>
+        <w:spacing w:before="120" w:after="0"/>
+      </w:pPr>
+      <w:r>
+        <w:rPr>
+          <w:b/>
+          <w:color w:val="000000"/>
+          <w:sz w:val="19"/>
+        </w:rPr>
+        <w:t>Require Technology — Remote, PR</w:t>
+      </w:r>
+      <w:r>
+        <w:tab/>
+      </w:r>
+      <w:r>
+        <w:rPr>
+          <w:color w:val="000000"/>
+          <w:sz w:val="18"/>
+        </w:rPr>
+        <w:t>2022 – 2023</w:t>
+      </w:r>
+    </w:p>
+    <w:p>
+      <w:pPr>
+        <w:spacing w:before="0" w:after="40"/>
+      </w:pPr>
+      <w:r>
+        <w:rPr>
+          <w:i/>
+          <w:color w:val="444444"/>
+          <w:sz w:val="19"/>
+        </w:rPr>
+        <w:t>QA Associate / Software Developer</w:t>
+      </w:r>
+    </w:p>
+    <w:p>
+      <w:pPr>
+        <w:pStyle w:val="ListBullet"/>
+        <w:spacing w:before="0" w:after="20"/>
+        <w:ind w:left="360"/>
+      </w:pPr>
+      <w:r>
+        <w:rPr>
+          <w:color w:val="1A1A1A"/>
+          <w:sz w:val="18"/>
+        </w:rPr>
+        <w:t>Built React frontend components with reusable hooks and modern component patterns</w:t>
+      </w:r>
+    </w:p>
+    <w:p>
+      <w:pPr>
+        <w:pStyle w:val="ListBullet"/>
+        <w:spacing w:before="0" w:after="20"/>
+        <w:ind w:left="360"/>
+      </w:pPr>
+      <w:r>
+        <w:rPr>
+          <w:color w:val="1A1A1A"/>
+          <w:sz w:val="18"/>
+        </w:rPr>
+        <w:t>Led Cypress-to-Playwright migration, improving cross-browser test stability and reducing E2E execution time</w:t>
+      </w:r>
+    </w:p>
+    <w:p>
+      <w:pPr>
+        <w:tabs>
+          <w:tab w:pos="9216" w:val="right"/>
+        </w:tabs>
+        <w:spacing w:before="120" w:after="0"/>
+      </w:pPr>
+      <w:r>
+        <w:rPr>
+          <w:b/>
+          <w:color w:val="000000"/>
+          <w:sz w:val="19"/>
+        </w:rPr>
+        <w:t>Truenorth Corporation — Remote, PR</w:t>
+      </w:r>
+      <w:r>
+        <w:tab/>
+      </w:r>
+      <w:r>
+        <w:rPr>
+          <w:color w:val="000000"/>
+          <w:sz w:val="18"/>
+        </w:rPr>
+        <w:t>2021 – 2022</w:t>
+      </w:r>
+    </w:p>
+    <w:p>
+      <w:pPr>
+        <w:spacing w:before="0" w:after="40"/>
+      </w:pPr>
+      <w:r>
+        <w:rPr>
+          <w:i/>
+          <w:color w:val="444444"/>
+          <w:sz w:val="19"/>
+        </w:rPr>
+        <w:t>Software Developer I</w:t>
+      </w:r>
+    </w:p>
+    <w:p>
+      <w:pPr>
+        <w:pStyle w:val="ListBullet"/>
+        <w:spacing w:before="0" w:after="20"/>
+        <w:ind w:left="360"/>
+      </w:pPr>
+      <w:r>
+        <w:rPr>
+          <w:color w:val="1A1A1A"/>
+          <w:sz w:val="18"/>
+        </w:rPr>
+        <w:t>Developed .NET backend modules and SQL Server integrations for government-facing digital platforms</w:t>
+      </w:r>
+    </w:p>
+    <w:p>
+      <w:pPr>
+        <w:pStyle w:val="ListBullet"/>
+        <w:spacing w:before="0" w:after="20"/>
+        <w:ind w:left="360"/>
+      </w:pPr>
+      <w:r>
+        <w:rPr>
+          <w:color w:val="1A1A1A"/>
+          <w:sz w:val="18"/>
+        </w:rPr>
+        <w:t>Implemented automated deployment pipelines using Azure DevOps, reducing manual release steps</w:t>
+      </w:r>
+    </w:p>
+    <w:p>
+      <w:pPr>
+        <w:spacing w:before="160" w:after="60"/>
+        <w:pBdr>
+          <w:bottom w:val="single" w:sz="6" w:space="1" w:color="000000"/>
+        </w:pBdr>
+      </w:pPr>
+      <w:r>
+        <w:rPr>
+          <w:b/>
+          <w:color w:val="000000"/>
+          <w:sz w:val="20"/>
+        </w:rPr>
+        <w:t>Education</w:t>
+      </w:r>
+    </w:p>
+    <w:p>
+      <w:pPr>
+        <w:tabs>
+          <w:tab w:pos="9216" w:val="right"/>
+        </w:tabs>
+        <w:spacing w:before="120" w:after="0"/>
+      </w:pPr>
+      <w:r>
+        <w:rPr>
+          <w:b/>
+          <w:color w:val="000000"/>
+          <w:sz w:val="19"/>
+        </w:rPr>
+        <w:t>University of Puerto Rico — Associate’s Degree, Computer Science</w:t>
+      </w:r>
+      <w:r>
+        <w:tab/>
+      </w:r>
+      <w:r>
+        <w:rPr>
+          <w:color w:val="000000"/>
+          <w:sz w:val="18"/>
+        </w:rPr>
+        <w:t>2023 – 2025</w:t>
+      </w:r>
+    </w:p>
+    <w:p>
+      <w:pPr>
+        <w:spacing w:before="160" w:after="60"/>
+        <w:pBdr>
+          <w:bottom w:val="single" w:sz="6" w:space="1" w:color="000000"/>
+        </w:pBdr>
+      </w:pPr>
+      <w:r>
+        <w:rPr>
+          <w:b/>
+          <w:color w:val="000000"/>
+          <w:sz w:val="20"/>
+        </w:rPr>
+        <w:t>Projects ↗</w:t>
+      </w:r>
+    </w:p>
+    <w:p>
+      <w:pPr>
+        <w:spacing w:before="0" w:after="20"/>
+      </w:pPr>
+      <w:r>
+        <w:rPr>
+          <w:b/>
+          <w:color w:val="000000"/>
+          <w:sz w:val="18"/>
+        </w:rPr>
+        <w:t>BerriosPay</w:t>
+      </w:r>
+      <w:r>
+        <w:rPr>
+          <w:color w:val="1A1A1A"/>
+          <w:sz w:val="18"/>
+        </w:rPr>
+        <w:t xml:space="preserve"> — Full-stack payment kiosk: React 19, .NET 10, WPF, Azure SQL. 25+ kiosks, zero duplicate txns, PCI DSS compliant</w:t>
+      </w:r>
+    </w:p>
+    <w:p>
+      <w:pPr>
+        <w:spacing w:before="0" w:after="20"/>
+      </w:pPr>
+      <w:r>
+        <w:rPr>
+          <w:b/>
+          <w:color w:val="000000"/>
+          <w:sz w:val="18"/>
+        </w:rPr>
+        <w:t>GoFleetCare</w:t>
+      </w:r>
+      <w:r>
+        <w:rPr>
+          <w:color w:val="1A1A1A"/>
+          <w:sz w:val="18"/>
+        </w:rPr>
+        <w:t xml:space="preserve"> — HIPAA-adjacent medical transport: React, Firebase, WebSocket. 13-state status flow, offline sync, 215 tests</w:t>
+      </w:r>
+    </w:p>
+    <w:p>
+      <w:pPr>
+        <w:spacing w:before="0" w:after="20"/>
+      </w:pPr>
+      <w:r>
+        <w:rPr>
+          <w:b/>
+          <w:color w:val="000000"/>
+          <w:sz w:val="18"/>
+        </w:rPr>
+        <w:t>CDD-HUB</w:t>
+      </w:r>
+      <w:r>
+        <w:rPr>
+          <w:color w:val="1A1A1A"/>
+          <w:sz w:val="18"/>
+        </w:rPr>
+        <w:t xml:space="preserve"> — Operations portal shipped in 3.5 weeks with 215 automated tests (Vitest + Playwright E2E)</w:t>
+      </w:r>
+    </w:p>
+    <w:p>
+      <w:pPr>
+        <w:spacing w:before="0" w:after="20"/>
+      </w:pPr>
+      <w:r>
+        <w:rPr>
+          <w:b/>
+          <w:color w:val="000000"/>
+          <w:sz w:val="18"/>
+        </w:rPr>
+        <w:t>Salud Medica</w:t>
+      </w:r>
+      <w:r>
+        <w:rPr>
+          <w:color w:val="1A1A1A"/>
+          <w:sz w:val="18"/>
+        </w:rPr>
+        <w:t xml:space="preserve"> — Ionic/Capacitor tablet POS with Star Micronics printer and cash drawer for Android</w:t>
+      </w:r>
+    </w:p>
+    <w:p>
+      <w:pPr>
+        <w:spacing w:before="0" w:after="20"/>
+      </w:pPr>
+      <w:r>
+        <w:rPr>
+          <w:b/>
+          <w:color w:val="000000"/>
+          <w:sz w:val="18"/>
+        </w:rPr>
+        <w:t>AI-Directed Dev</w:t>
+      </w:r>
+      <w:r>
+        <w:rPr>
+          <w:color w:val="1A1A1A"/>
+          <w:sz w:val="18"/>
+        </w:rPr>
+        <w:t xml:space="preserve"> — Published methodology: CLAUDE.md, 7-phase plans, AI review pipelines. 6x velocity increase measured over 6 months</w:t>
+      </w:r>
+    </w:p>
+    <w:p>
+      <w:pPr>
+        <w:spacing w:before="160" w:after="60"/>
+        <w:pBdr>
+          <w:bottom w:val="single" w:sz="6" w:space="1" w:color="000000"/>
+        </w:pBdr>
+      </w:pPr>
+      <w:r>
+        <w:rPr>
+          <w:b/>
+          <w:color w:val="000000"/>
+          <w:sz w:val="20"/>
+        </w:rPr>
+        <w:t>Interests</w:t>
+      </w:r>
+    </w:p>
+    <w:p>
+      <w:r>
+        <w:rPr>
+          <w:color w:val="444444"/>
+          <w:sz w:val="18"/>
+        </w:rPr>
+        <w:t>AI-Augmented Engineering, Payment Systems Architecture, Open Source, Puerto Rico Tech Community</w:t>
+      </w:r>
+    </w:p>
+    <w:sectPr>
+      <w:pgSz w:w="12240" w:h="15840"/>
+      <w:pgMar w:top="576" w:right="792" w:bottom="576" w:left="792" w:header="720" w:footer="720" w:gutter="0"/>
+      <w:cols w:space="720"/>
+      <w:docGrid w:linePitch="360"/>
+    </w:sectPr>
+  </w:body>
+</w:document>
 </file>
 
 <file path=word/numbering.xml><?xml version="1.0" encoding="utf-8"?>
@@ -1743,12 +1307,12 @@
     <w:qFormat/>
     <w:rsid w:val="00FC693F"/>
     <w:pPr>
-      <w:spacing w:after="40" w:before="0"/>
+      <w:spacing w:after="20" w:before="0"/>
     </w:pPr>
     <w:rPr>
       <w:rFonts w:ascii="Calibri" w:hAnsi="Calibri"/>
-      <w:color w:val="333333"/>
-      <w:sz w:val="20"/>
+      <w:color w:val="1A1A1A"/>
+      <w:sz w:val="19"/>
     </w:rPr>
   </w:style>
   <w:style w:type="paragraph" w:styleId="Header">

</xml_diff>

<commit_message>
feat: add LeadFlow project and interactive recruiter match wizard
- Add LeadFlow as first portfolio project with live SaaS badge, landing
  page screenshot, and full tech stack tags
- Add recruiter wizard: floating robot trigger, 4-step wizard flow with
  typing animations, job description analyzer, and animated results
- Scoring engine with 11 skill categories, 24 transferable skill mappings,
  word-boundary matching for short keywords, and multilingual support
  (EN/ES/PT/FR) with bilingual pivot
- Honest scoring: domain mismatches show low scores with red theme,
  matching JDs show green/blue with confetti
- HTML-escaped all dynamic strings in innerHTML, interval cleanup on
  re-analysis, deterministic fallback scores
- Updated resume assets
</commit_message>
<xml_diff>
--- a/assets/LA_Resume_.docx
+++ b/assets/LA_Resume_.docx
@@ -148,14 +148,14 @@
           <w:color w:val="000000"/>
           <w:sz w:val="18"/>
         </w:rPr>
-        <w:t xml:space="preserve">AI Tooling: </w:t>
+        <w:t xml:space="preserve">Testing: </w:t>
       </w:r>
       <w:r>
         <w:rPr>
           <w:color w:val="1A1A1A"/>
           <w:sz w:val="18"/>
         </w:rPr>
-        <w:t>Claude Code, ChatGPT/Codex, Gemini, Grok, NotebookLM, CLAUDE.md context engineering, AI code review pipelines</w:t>
+        <w:t>Vitest, Playwright E2E, Jest, Cypress | Security: JWT, RBAC, PCI DSS, WCAG 2.1 AA</w:t>
       </w:r>
     </w:p>
     <w:p>
@@ -168,14 +168,14 @@
           <w:color w:val="000000"/>
           <w:sz w:val="18"/>
         </w:rPr>
-        <w:t xml:space="preserve">Testing: </w:t>
+        <w:t xml:space="preserve">Tools: </w:t>
       </w:r>
       <w:r>
         <w:rPr>
           <w:color w:val="1A1A1A"/>
           <w:sz w:val="18"/>
         </w:rPr>
-        <w:t>Vitest, Playwright E2E, Jest, Cypress | Security: JWT, RBAC, PCI DSS, WCAG 2.1 AA</w:t>
+        <w:t>VS Code, Git, Postman, Figma, Jira, Azure Data Studio, Serilog, Claude Code, GitHub Copilot</w:t>
       </w:r>
     </w:p>
     <w:p>
@@ -230,7 +230,7 @@
           <w:color w:val="444444"/>
           <w:sz w:val="19"/>
         </w:rPr>
-        <w:t>Systems Architect &amp; AI-Augmented Engineering Lead</w:t>
+        <w:t>Senior Full-Stack Engineer &amp; Technical Lead</w:t>
       </w:r>
     </w:p>
     <w:p>
@@ -244,21 +244,7 @@
           <w:color w:val="1A1A1A"/>
           <w:sz w:val="18"/>
         </w:rPr>
-        <w:t>Promoted from mid-level to systems architect within 3 months; sole technical decision-maker across 50+ active projects</w:t>
-      </w:r>
-    </w:p>
-    <w:p>
-      <w:pPr>
-        <w:pStyle w:val="ListBullet"/>
-        <w:spacing w:before="0" w:after="20"/>
-        <w:ind w:left="360"/>
-      </w:pPr>
-      <w:r>
-        <w:rPr>
-          <w:color w:val="1A1A1A"/>
-          <w:sz w:val="18"/>
-        </w:rPr>
-        <w:t>Designed AI-directed development workflow (CLAUDE.md, 7-phase plans, automated reviews), increasing delivery velocity 6x — from 9 to 54 commits/month</w:t>
+        <w:t>Promoted from mid-level to technical lead within 3 months; sole engineer and decision-maker across 50+ active projects</w:t>
       </w:r>
     </w:p>
     <w:p>
@@ -273,6 +259,20 @@
           <w:sz w:val="18"/>
         </w:rPr>
         <w:t>Shipped 4 production systems in 6 months as sole engineer, each from database schema to cloud deployment</w:t>
+      </w:r>
+    </w:p>
+    <w:p>
+      <w:pPr>
+        <w:pStyle w:val="ListBullet"/>
+        <w:spacing w:before="0" w:after="20"/>
+        <w:ind w:left="360"/>
+      </w:pPr>
+      <w:r>
+        <w:rPr>
+          <w:color w:val="1A1A1A"/>
+          <w:sz w:val="18"/>
+        </w:rPr>
+        <w:t>Deliver at team-level velocity as an individual contributor, covering architecture, frontend, backend, QA, and DevOps</w:t>
       </w:r>
     </w:p>
     <w:p>
@@ -299,7 +299,7 @@
           <w:color w:val="1A1A1A"/>
           <w:sz w:val="18"/>
         </w:rPr>
-        <w:t>Architected full-stack payment platform in 3 days: React 19 frontend, .NET 10 backend, WPF kiosk shell, Azure SQL — deployed across 25+ kiosks</w:t>
+        <w:t>Architected full-stack payment platform: React 19 frontend, .NET 10 backend with clean architecture, WPF kiosk shell, Azure SQL — deployed across 25+ kiosks</w:t>
       </w:r>
     </w:p>
     <w:p>
@@ -313,7 +313,21 @@
           <w:color w:val="1A1A1A"/>
           <w:sz w:val="18"/>
         </w:rPr>
-        <w:t>Engineered SHA256 idempotency with Polly circuit breakers, ensuring zero duplicate transactions across high-volume kiosks</w:t>
+        <w:t>Designed semi-integrated POS flow using PAX POSLink, decoupling PCI-sensitive card data to minimize audit scope (PCI DSS SAQ A)</w:t>
+      </w:r>
+    </w:p>
+    <w:p>
+      <w:pPr>
+        <w:pStyle w:val="ListBullet"/>
+        <w:spacing w:before="0" w:after="20"/>
+        <w:ind w:left="360"/>
+      </w:pPr>
+      <w:r>
+        <w:rPr>
+          <w:color w:val="1A1A1A"/>
+          <w:sz w:val="18"/>
+        </w:rPr>
+        <w:t>Engineered SHA256 idempotency with Polly circuit breakers, retry, and bulkhead isolation — zero duplicate transactions across high-volume kiosks</w:t>
       </w:r>
     </w:p>
     <w:p>
@@ -368,7 +382,7 @@
           <w:color w:val="1A1A1A"/>
           <w:sz w:val="18"/>
         </w:rPr>
-        <w:t>Architected two HIPAA-adjacent driver portals with real-time trip management, geofencing, and signature capture</w:t>
+        <w:t>Architected two HIPAA-adjacent driver portals with real-time trip management, geofencing, signature capture, and push notifications</w:t>
       </w:r>
     </w:p>
     <w:p>
@@ -467,7 +481,7 @@
           <w:color w:val="000000"/>
           <w:sz w:val="19"/>
         </w:rPr>
-        <w:t>Highspring Digital — Remote</w:t>
+        <w:t>Highspring Digital — Remote (Contract)</w:t>
       </w:r>
       <w:r>
         <w:tab/>
@@ -629,7 +643,7 @@
           <w:color w:val="000000"/>
           <w:sz w:val="19"/>
         </w:rPr>
-        <w:t>Require Technology — Remote, PR</w:t>
+        <w:t>Contract Engagements — Remote, PR</w:t>
       </w:r>
       <w:r>
         <w:tab/>
@@ -639,7 +653,7 @@
           <w:color w:val="000000"/>
           <w:sz w:val="18"/>
         </w:rPr>
-        <w:t>2022 – 2023</w:t>
+        <w:t>2021 – 2023</w:t>
       </w:r>
     </w:p>
     <w:p>
@@ -652,7 +666,7 @@
           <w:color w:val="444444"/>
           <w:sz w:val="19"/>
         </w:rPr>
-        <w:t>QA Associate / Software Developer</w:t>
+        <w:t>Software Developer</w:t>
       </w:r>
     </w:p>
     <w:p>
@@ -666,7 +680,7 @@
           <w:color w:val="1A1A1A"/>
           <w:sz w:val="18"/>
         </w:rPr>
-        <w:t>Built React frontend components with reusable hooks and modern component patterns</w:t>
+        <w:t>Require Technology (2022–2023): Built React frontend components; led Cypress-to-Playwright migration, improving cross-browser test stability</w:t>
       </w:r>
     </w:p>
     <w:p>
@@ -680,74 +694,7 @@
           <w:color w:val="1A1A1A"/>
           <w:sz w:val="18"/>
         </w:rPr>
-        <w:t>Led Cypress-to-Playwright migration, improving cross-browser test stability and reducing E2E execution time</w:t>
-      </w:r>
-    </w:p>
-    <w:p>
-      <w:pPr>
-        <w:tabs>
-          <w:tab w:pos="9216" w:val="right"/>
-        </w:tabs>
-        <w:spacing w:before="120" w:after="0"/>
-      </w:pPr>
-      <w:r>
-        <w:rPr>
-          <w:b/>
-          <w:color w:val="000000"/>
-          <w:sz w:val="19"/>
-        </w:rPr>
-        <w:t>Truenorth Corporation — Remote, PR</w:t>
-      </w:r>
-      <w:r>
-        <w:tab/>
-      </w:r>
-      <w:r>
-        <w:rPr>
-          <w:color w:val="000000"/>
-          <w:sz w:val="18"/>
-        </w:rPr>
-        <w:t>2021 – 2022</w:t>
-      </w:r>
-    </w:p>
-    <w:p>
-      <w:pPr>
-        <w:spacing w:before="0" w:after="40"/>
-      </w:pPr>
-      <w:r>
-        <w:rPr>
-          <w:i/>
-          <w:color w:val="444444"/>
-          <w:sz w:val="19"/>
-        </w:rPr>
-        <w:t>Software Developer I</w:t>
-      </w:r>
-    </w:p>
-    <w:p>
-      <w:pPr>
-        <w:pStyle w:val="ListBullet"/>
-        <w:spacing w:before="0" w:after="20"/>
-        <w:ind w:left="360"/>
-      </w:pPr>
-      <w:r>
-        <w:rPr>
-          <w:color w:val="1A1A1A"/>
-          <w:sz w:val="18"/>
-        </w:rPr>
-        <w:t>Developed .NET backend modules and SQL Server integrations for government-facing digital platforms</w:t>
-      </w:r>
-    </w:p>
-    <w:p>
-      <w:pPr>
-        <w:pStyle w:val="ListBullet"/>
-        <w:spacing w:before="0" w:after="20"/>
-        <w:ind w:left="360"/>
-      </w:pPr>
-      <w:r>
-        <w:rPr>
-          <w:color w:val="1A1A1A"/>
-          <w:sz w:val="18"/>
-        </w:rPr>
-        <w:t>Implemented automated deployment pipelines using Azure DevOps, reducing manual release steps</w:t>
+        <w:t>Truenorth Corporation (2021–2022): Developed .NET backend modules and SQL Server integrations for government platforms; automated deployment pipelines via Azure DevOps</w:t>
       </w:r>
     </w:p>
     <w:p>
@@ -794,6 +741,19 @@
     </w:p>
     <w:p>
       <w:pPr>
+        <w:spacing w:before="0" w:after="20"/>
+      </w:pPr>
+      <w:r>
+        <w:rPr>
+          <w:i/>
+          <w:color w:val="444444"/>
+          <w:sz w:val="17"/>
+        </w:rPr>
+        <w:t>Supplemented by 5+ years of professional software engineering across enterprise, government, and healthcare systems</w:t>
+      </w:r>
+    </w:p>
+    <w:p>
+      <w:pPr>
         <w:spacing w:before="160" w:after="60"/>
         <w:pBdr>
           <w:bottom w:val="single" w:sz="6" w:space="1" w:color="000000"/>
@@ -806,6 +766,66 @@
           <w:sz w:val="20"/>
         </w:rPr>
         <w:t>Projects ↗</w:t>
+      </w:r>
+    </w:p>
+    <w:p>
+      <w:pPr>
+        <w:spacing w:before="0" w:after="20"/>
+      </w:pPr>
+      <w:r>
+        <w:rPr>
+          <w:b/>
+          <w:color w:val="000000"/>
+          <w:sz w:val="18"/>
+        </w:rPr>
+        <w:t>AI QA Agent</w:t>
+      </w:r>
+      <w:r>
+        <w:rPr>
+          <w:color w:val="1A1A1A"/>
+          <w:sz w:val="18"/>
+        </w:rPr>
+        <w:t xml:space="preserve"> — Agentic accessibility/SEO/performance testing tool. Next.js 15, Claude API tool_use, SSE streaming — ai-qa-agent.vercel.app</w:t>
+      </w:r>
+    </w:p>
+    <w:p>
+      <w:pPr>
+        <w:spacing w:before="0" w:after="20"/>
+      </w:pPr>
+      <w:r>
+        <w:rPr>
+          <w:b/>
+          <w:color w:val="000000"/>
+          <w:sz w:val="18"/>
+        </w:rPr>
+        <w:t>Agent Orchestra</w:t>
+      </w:r>
+      <w:r>
+        <w:rPr>
+          <w:color w:val="1A1A1A"/>
+          <w:sz w:val="18"/>
+        </w:rPr>
+        <w:t xml:space="preserve"> — Multi-agent AI pipeline (5 agents: Planner→Researcher→Writer→Critic→Editor). Next.js 15, Claude API, SSE</w:t>
+      </w:r>
+    </w:p>
+    <w:p>
+      <w:pPr>
+        <w:spacing w:before="0" w:after="20"/>
+      </w:pPr>
+      <w:r>
+        <w:rPr>
+          <w:b/>
+          <w:color w:val="000000"/>
+          <w:sz w:val="18"/>
+        </w:rPr>
+        <w:t>Dep Scanner</w:t>
+      </w:r>
+      <w:r>
+        <w:rPr>
+          <w:color w:val="1A1A1A"/>
+          <w:sz w:val="18"/>
+        </w:rPr>
+        <w:t xml:space="preserve"> — Dependency health scanner with 6 data sources and composite scoring — dep-scanner.vercel.app</w:t>
       </w:r>
     </w:p>
     <w:p>
@@ -870,46 +890,6 @@
     </w:p>
     <w:p>
       <w:pPr>
-        <w:spacing w:before="0" w:after="20"/>
-      </w:pPr>
-      <w:r>
-        <w:rPr>
-          <w:b/>
-          <w:color w:val="000000"/>
-          <w:sz w:val="18"/>
-        </w:rPr>
-        <w:t>Salud Medica</w:t>
-      </w:r>
-      <w:r>
-        <w:rPr>
-          <w:color w:val="1A1A1A"/>
-          <w:sz w:val="18"/>
-        </w:rPr>
-        <w:t xml:space="preserve"> — Ionic/Capacitor tablet POS with Star Micronics printer and cash drawer for Android</w:t>
-      </w:r>
-    </w:p>
-    <w:p>
-      <w:pPr>
-        <w:spacing w:before="0" w:after="20"/>
-      </w:pPr>
-      <w:r>
-        <w:rPr>
-          <w:b/>
-          <w:color w:val="000000"/>
-          <w:sz w:val="18"/>
-        </w:rPr>
-        <w:t>AI-Directed Dev</w:t>
-      </w:r>
-      <w:r>
-        <w:rPr>
-          <w:color w:val="1A1A1A"/>
-          <w:sz w:val="18"/>
-        </w:rPr>
-        <w:t xml:space="preserve"> — Published methodology: CLAUDE.md, 7-phase plans, AI review pipelines. 6x velocity increase measured over 6 months</w:t>
-      </w:r>
-    </w:p>
-    <w:p>
-      <w:pPr>
         <w:spacing w:before="160" w:after="60"/>
         <w:pBdr>
           <w:bottom w:val="single" w:sz="6" w:space="1" w:color="000000"/>
@@ -930,7 +910,7 @@
           <w:color w:val="444444"/>
           <w:sz w:val="18"/>
         </w:rPr>
-        <w:t>AI-Augmented Engineering, Payment Systems Architecture, Open Source, Puerto Rico Tech Community</w:t>
+        <w:t>Distributed Systems, Payment Architecture, Developer Tooling, Open Source, Puerto Rico Tech Community</w:t>
       </w:r>
     </w:p>
     <w:sectPr>

</xml_diff>